<commit_message>
csp Content Security Policy 적용
</commit_message>
<xml_diff>
--- a/docs/security/07_XSS.docx
+++ b/docs/security/07_XSS.docx
@@ -328,55 +328,7 @@
           <w:sz w:val="18"/>
           <w:szCs w:val="18"/>
         </w:rPr>
-        <w:t>@NotBlank(message = "Name</w:t>
-      </w:r>
-      <w:r>
-        <w:rPr>
-          <w:rFonts w:ascii="Consolas" w:hAnsi="Consolas"/>
-          <w:sz w:val="18"/>
-          <w:szCs w:val="18"/>
-        </w:rPr>
-        <w:t>은</w:t>
-      </w:r>
-      <w:r>
-        <w:rPr>
-          <w:rFonts w:ascii="Consolas" w:hAnsi="Consolas"/>
-          <w:sz w:val="18"/>
-          <w:szCs w:val="18"/>
-        </w:rPr>
-        <w:t xml:space="preserve"> </w:t>
-      </w:r>
-      <w:r>
-        <w:rPr>
-          <w:rFonts w:ascii="Consolas" w:hAnsi="Consolas"/>
-          <w:sz w:val="18"/>
-          <w:szCs w:val="18"/>
-        </w:rPr>
-        <w:t>필수</w:t>
-      </w:r>
-      <w:r>
-        <w:rPr>
-          <w:rFonts w:ascii="Consolas" w:hAnsi="Consolas"/>
-          <w:sz w:val="18"/>
-          <w:szCs w:val="18"/>
-        </w:rPr>
-        <w:t xml:space="preserve"> </w:t>
-      </w:r>
-      <w:r>
-        <w:rPr>
-          <w:rFonts w:ascii="Consolas" w:hAnsi="Consolas"/>
-          <w:sz w:val="18"/>
-          <w:szCs w:val="18"/>
-        </w:rPr>
-        <w:t>입력항목입니다</w:t>
-      </w:r>
-      <w:r>
-        <w:rPr>
-          <w:rFonts w:ascii="Consolas" w:hAnsi="Consolas"/>
-          <w:sz w:val="18"/>
-          <w:szCs w:val="18"/>
-        </w:rPr>
-        <w:t>.")</w:t>
+        <w:t xml:space="preserve">@NotBlank(message = "Name은 필수 입력항목입니다.")</w:t>
       </w:r>
     </w:p>
     <w:p>
@@ -444,631 +396,159 @@
           <w:sz w:val="18"/>
           <w:szCs w:val="18"/>
         </w:rPr>
-        <w:t>//[</w:t>
-      </w:r>
+        <w:t xml:space="preserve">//[안전 ✅][XSS 하드닝] index.html 은 th:text(자동 이스케이프)로 렌더링한다.</w:t>
+      </w:r>
+    </w:p>
+    <w:p>
+      <w:pPr>
+        <w:pBdr>
+          <w:left w:val="single" w:sz="18" w:space="6" w:color="C0C0C0"/>
+        </w:pBdr>
+        <w:shd w:val="clear" w:color="auto" w:fill="F4F4F4"/>
+      </w:pPr>
       <w:r>
         <w:rPr>
           <w:rFonts w:ascii="Consolas" w:hAnsi="Consolas"/>
           <w:sz w:val="18"/>
           <w:szCs w:val="18"/>
         </w:rPr>
-        <w:t>안전</w:t>
-      </w:r>
+        <w:t>@GetMapping("/index")</w:t>
+      </w:r>
+    </w:p>
+    <w:p>
+      <w:pPr>
+        <w:pBdr>
+          <w:left w:val="single" w:sz="18" w:space="6" w:color="C0C0C0"/>
+        </w:pBdr>
+        <w:shd w:val="clear" w:color="auto" w:fill="F4F4F4"/>
+      </w:pPr>
       <w:r>
         <w:rPr>
           <w:rFonts w:ascii="Consolas" w:hAnsi="Consolas"/>
           <w:sz w:val="18"/>
           <w:szCs w:val="18"/>
         </w:rPr>
-        <w:t xml:space="preserve"> ✅][XSS </w:t>
-      </w:r>
+        <w:t>public String index(Model model) {</w:t>
+      </w:r>
+    </w:p>
+    <w:p>
+      <w:pPr>
+        <w:pBdr>
+          <w:left w:val="single" w:sz="18" w:space="6" w:color="C0C0C0"/>
+        </w:pBdr>
+        <w:shd w:val="clear" w:color="auto" w:fill="F4F4F4"/>
+      </w:pPr>
       <w:r>
         <w:rPr>
           <w:rFonts w:ascii="Consolas" w:hAnsi="Consolas"/>
           <w:sz w:val="18"/>
           <w:szCs w:val="18"/>
         </w:rPr>
-        <w:t>하드닝</w:t>
-      </w:r>
+        <w:t xml:space="preserve">    model.addAttribute("users", userRepository.findAll());</w:t>
+      </w:r>
+    </w:p>
+    <w:p>
+      <w:pPr>
+        <w:pBdr>
+          <w:left w:val="single" w:sz="18" w:space="6" w:color="C0C0C0"/>
+        </w:pBdr>
+        <w:shd w:val="clear" w:color="auto" w:fill="F4F4F4"/>
+      </w:pPr>
       <w:r>
         <w:rPr>
           <w:rFonts w:ascii="Consolas" w:hAnsi="Consolas"/>
           <w:sz w:val="18"/>
           <w:szCs w:val="18"/>
         </w:rPr>
-        <w:t xml:space="preserve">] index.html </w:t>
-      </w:r>
+        <w:t xml:space="preserve">    return "index";</w:t>
+      </w:r>
+    </w:p>
+    <w:p>
+      <w:pPr>
+        <w:pBdr>
+          <w:left w:val="single" w:sz="18" w:space="6" w:color="C0C0C0"/>
+          <w:bottom w:val="single" w:sz="4" w:space="3" w:color="D9D9D9"/>
+        </w:pBdr>
+        <w:shd w:val="clear" w:color="auto" w:fill="F4F4F4"/>
+      </w:pPr>
       <w:r>
         <w:rPr>
           <w:rFonts w:ascii="Consolas" w:hAnsi="Consolas"/>
           <w:sz w:val="18"/>
           <w:szCs w:val="18"/>
         </w:rPr>
-        <w:t>은</w:t>
-      </w:r>
+        <w:t>}</w:t>
+      </w:r>
+    </w:p>
+    <w:p>
+      <w:pPr>
+        <w:spacing w:after="80" w:line="272" w:lineRule="auto"/>
+        <w:rPr>
+          <w:b/>
+          <w:bCs/>
+        </w:rPr>
+      </w:pPr>
+    </w:p>
+    <w:p>
+      <w:pPr>
+        <w:spacing w:after="80" w:line="272" w:lineRule="auto"/>
+      </w:pPr>
+      <w:r>
+        <w:rPr>
+          <w:b/>
+          <w:bCs/>
+        </w:rPr>
+        <w:lastRenderedPageBreak/>
+        <w:t>② 취약 — /users/index-vuln (th:utext, 공격 재현 전용)</w:t>
+      </w:r>
+    </w:p>
+    <w:p>
+      <w:pPr>
+        <w:pBdr>
+          <w:top w:val="single" w:sz="4" w:space="3" w:color="D9D9D9"/>
+          <w:left w:val="single" w:sz="18" w:space="6" w:color="C0C0C0"/>
+        </w:pBdr>
+        <w:shd w:val="clear" w:color="auto" w:fill="F4F4F4"/>
+      </w:pPr>
       <w:r>
         <w:rPr>
           <w:rFonts w:ascii="Consolas" w:hAnsi="Consolas"/>
           <w:sz w:val="18"/>
           <w:szCs w:val="18"/>
         </w:rPr>
-        <w:t xml:space="preserve"> th:text(</w:t>
-      </w:r>
+        <w:t xml:space="preserve">//[취약 ⚠️ - Stored XSS 공격 재현 실습 전용]</w:t>
+      </w:r>
+    </w:p>
+    <w:p>
+      <w:pPr>
+        <w:pBdr>
+          <w:left w:val="single" w:sz="18" w:space="6" w:color="C0C0C0"/>
+        </w:pBdr>
+        <w:shd w:val="clear" w:color="auto" w:fill="F4F4F4"/>
+      </w:pPr>
       <w:r>
         <w:rPr>
           <w:rFonts w:ascii="Consolas" w:hAnsi="Consolas"/>
           <w:sz w:val="18"/>
           <w:szCs w:val="18"/>
         </w:rPr>
-        <w:t>자동</w:t>
-      </w:r>
+        <w:t xml:space="preserve">//  이름에 &lt;script&gt;...&lt;/script&gt; 를 넣고 저장하면, 이 목록 페이지를 보는</w:t>
+      </w:r>
+    </w:p>
+    <w:p>
+      <w:pPr>
+        <w:pBdr>
+          <w:left w:val="single" w:sz="18" w:space="6" w:color="C0C0C0"/>
+        </w:pBdr>
+        <w:shd w:val="clear" w:color="auto" w:fill="F4F4F4"/>
+      </w:pPr>
       <w:r>
         <w:rPr>
           <w:rFonts w:ascii="Consolas" w:hAnsi="Consolas"/>
           <w:sz w:val="18"/>
           <w:szCs w:val="18"/>
         </w:rPr>
-        <w:t xml:space="preserve"> </w:t>
-      </w:r>
-      <w:r>
-        <w:rPr>
-          <w:rFonts w:ascii="Consolas" w:hAnsi="Consolas"/>
-          <w:sz w:val="18"/>
-          <w:szCs w:val="18"/>
-        </w:rPr>
-        <w:t>이스케이프</w:t>
-      </w:r>
-      <w:r>
-        <w:rPr>
-          <w:rFonts w:ascii="Consolas" w:hAnsi="Consolas"/>
-          <w:sz w:val="18"/>
-          <w:szCs w:val="18"/>
-        </w:rPr>
-        <w:t>)</w:t>
-      </w:r>
-      <w:r>
-        <w:rPr>
-          <w:rFonts w:ascii="Consolas" w:hAnsi="Consolas"/>
-          <w:sz w:val="18"/>
-          <w:szCs w:val="18"/>
-        </w:rPr>
-        <w:t>로</w:t>
-      </w:r>
-      <w:r>
-        <w:rPr>
-          <w:rFonts w:ascii="Consolas" w:hAnsi="Consolas"/>
-          <w:sz w:val="18"/>
-          <w:szCs w:val="18"/>
-        </w:rPr>
-        <w:t xml:space="preserve"> </w:t>
-      </w:r>
-      <w:r>
-        <w:rPr>
-          <w:rFonts w:ascii="Consolas" w:hAnsi="Consolas"/>
-          <w:sz w:val="18"/>
-          <w:szCs w:val="18"/>
-        </w:rPr>
-        <w:t>렌더링한다</w:t>
-      </w:r>
-      <w:r>
-        <w:rPr>
-          <w:rFonts w:ascii="Consolas" w:hAnsi="Consolas"/>
-          <w:sz w:val="18"/>
-          <w:szCs w:val="18"/>
-        </w:rPr>
-        <w:t>.</w:t>
-      </w:r>
-    </w:p>
-    <w:p>
-      <w:pPr>
-        <w:pBdr>
-          <w:left w:val="single" w:sz="18" w:space="6" w:color="C0C0C0"/>
-        </w:pBdr>
-        <w:shd w:val="clear" w:color="auto" w:fill="F4F4F4"/>
-      </w:pPr>
-      <w:r>
-        <w:rPr>
-          <w:rFonts w:ascii="Consolas" w:hAnsi="Consolas"/>
-          <w:sz w:val="18"/>
-          <w:szCs w:val="18"/>
-        </w:rPr>
-        <w:t>@GetMapping("/index")</w:t>
-      </w:r>
-    </w:p>
-    <w:p>
-      <w:pPr>
-        <w:pBdr>
-          <w:left w:val="single" w:sz="18" w:space="6" w:color="C0C0C0"/>
-        </w:pBdr>
-        <w:shd w:val="clear" w:color="auto" w:fill="F4F4F4"/>
-      </w:pPr>
-      <w:r>
-        <w:rPr>
-          <w:rFonts w:ascii="Consolas" w:hAnsi="Consolas"/>
-          <w:sz w:val="18"/>
-          <w:szCs w:val="18"/>
-        </w:rPr>
-        <w:t>public String index(Model model) {</w:t>
-      </w:r>
-    </w:p>
-    <w:p>
-      <w:pPr>
-        <w:pBdr>
-          <w:left w:val="single" w:sz="18" w:space="6" w:color="C0C0C0"/>
-        </w:pBdr>
-        <w:shd w:val="clear" w:color="auto" w:fill="F4F4F4"/>
-      </w:pPr>
-      <w:r>
-        <w:rPr>
-          <w:rFonts w:ascii="Consolas" w:hAnsi="Consolas"/>
-          <w:sz w:val="18"/>
-          <w:szCs w:val="18"/>
-        </w:rPr>
-        <w:t xml:space="preserve">    model.addAttribute("users", userRepository.findAll());</w:t>
-      </w:r>
-    </w:p>
-    <w:p>
-      <w:pPr>
-        <w:pBdr>
-          <w:left w:val="single" w:sz="18" w:space="6" w:color="C0C0C0"/>
-        </w:pBdr>
-        <w:shd w:val="clear" w:color="auto" w:fill="F4F4F4"/>
-      </w:pPr>
-      <w:r>
-        <w:rPr>
-          <w:rFonts w:ascii="Consolas" w:hAnsi="Consolas"/>
-          <w:sz w:val="18"/>
-          <w:szCs w:val="18"/>
-        </w:rPr>
-        <w:t xml:space="preserve">    return "index";</w:t>
-      </w:r>
-    </w:p>
-    <w:p>
-      <w:pPr>
-        <w:pBdr>
-          <w:left w:val="single" w:sz="18" w:space="6" w:color="C0C0C0"/>
-          <w:bottom w:val="single" w:sz="4" w:space="3" w:color="D9D9D9"/>
-        </w:pBdr>
-        <w:shd w:val="clear" w:color="auto" w:fill="F4F4F4"/>
-      </w:pPr>
-      <w:r>
-        <w:rPr>
-          <w:rFonts w:ascii="Consolas" w:hAnsi="Consolas"/>
-          <w:sz w:val="18"/>
-          <w:szCs w:val="18"/>
-        </w:rPr>
-        <w:t>}</w:t>
-      </w:r>
-    </w:p>
-    <w:p>
-      <w:pPr>
-        <w:spacing w:after="80" w:line="272" w:lineRule="auto"/>
-        <w:rPr>
-          <w:b/>
-          <w:bCs/>
-        </w:rPr>
-      </w:pPr>
-    </w:p>
-    <w:p>
-      <w:pPr>
-        <w:spacing w:after="80" w:line="272" w:lineRule="auto"/>
-      </w:pPr>
-      <w:r>
-        <w:rPr>
-          <w:b/>
-          <w:bCs/>
-        </w:rPr>
-        <w:lastRenderedPageBreak/>
-        <w:t>② 취약 — /users/index-vuln (th:utext, 공격 재현 전용)</w:t>
-      </w:r>
-    </w:p>
-    <w:p>
-      <w:pPr>
-        <w:pBdr>
-          <w:top w:val="single" w:sz="4" w:space="3" w:color="D9D9D9"/>
-          <w:left w:val="single" w:sz="18" w:space="6" w:color="C0C0C0"/>
-        </w:pBdr>
-        <w:shd w:val="clear" w:color="auto" w:fill="F4F4F4"/>
-      </w:pPr>
-      <w:r>
-        <w:rPr>
-          <w:rFonts w:ascii="Consolas" w:hAnsi="Consolas"/>
-          <w:sz w:val="18"/>
-          <w:szCs w:val="18"/>
-        </w:rPr>
-        <w:t>//[</w:t>
-      </w:r>
-      <w:r>
-        <w:rPr>
-          <w:rFonts w:ascii="Consolas" w:hAnsi="Consolas"/>
-          <w:sz w:val="18"/>
-          <w:szCs w:val="18"/>
-        </w:rPr>
-        <w:t>취약</w:t>
-      </w:r>
-      <w:r>
-        <w:rPr>
-          <w:rFonts w:ascii="Consolas" w:hAnsi="Consolas"/>
-          <w:sz w:val="18"/>
-          <w:szCs w:val="18"/>
-        </w:rPr>
-        <w:t xml:space="preserve"> ⚠️ - Stored XSS </w:t>
-      </w:r>
-      <w:r>
-        <w:rPr>
-          <w:rFonts w:ascii="Consolas" w:hAnsi="Consolas"/>
-          <w:sz w:val="18"/>
-          <w:szCs w:val="18"/>
-        </w:rPr>
-        <w:t>공격</w:t>
-      </w:r>
-      <w:r>
-        <w:rPr>
-          <w:rFonts w:ascii="Consolas" w:hAnsi="Consolas"/>
-          <w:sz w:val="18"/>
-          <w:szCs w:val="18"/>
-        </w:rPr>
-        <w:t xml:space="preserve"> </w:t>
-      </w:r>
-      <w:r>
-        <w:rPr>
-          <w:rFonts w:ascii="Consolas" w:hAnsi="Consolas"/>
-          <w:sz w:val="18"/>
-          <w:szCs w:val="18"/>
-        </w:rPr>
-        <w:t>재현</w:t>
-      </w:r>
-      <w:r>
-        <w:rPr>
-          <w:rFonts w:ascii="Consolas" w:hAnsi="Consolas"/>
-          <w:sz w:val="18"/>
-          <w:szCs w:val="18"/>
-        </w:rPr>
-        <w:t xml:space="preserve"> </w:t>
-      </w:r>
-      <w:r>
-        <w:rPr>
-          <w:rFonts w:ascii="Consolas" w:hAnsi="Consolas"/>
-          <w:sz w:val="18"/>
-          <w:szCs w:val="18"/>
-        </w:rPr>
-        <w:t>실습</w:t>
-      </w:r>
-      <w:r>
-        <w:rPr>
-          <w:rFonts w:ascii="Consolas" w:hAnsi="Consolas"/>
-          <w:sz w:val="18"/>
-          <w:szCs w:val="18"/>
-        </w:rPr>
-        <w:t xml:space="preserve"> </w:t>
-      </w:r>
-      <w:r>
-        <w:rPr>
-          <w:rFonts w:ascii="Consolas" w:hAnsi="Consolas"/>
-          <w:sz w:val="18"/>
-          <w:szCs w:val="18"/>
-        </w:rPr>
-        <w:t>전용</w:t>
-      </w:r>
-      <w:r>
-        <w:rPr>
-          <w:rFonts w:ascii="Consolas" w:hAnsi="Consolas"/>
-          <w:sz w:val="18"/>
-          <w:szCs w:val="18"/>
-        </w:rPr>
-        <w:t>]</w:t>
-      </w:r>
-    </w:p>
-    <w:p>
-      <w:pPr>
-        <w:pBdr>
-          <w:left w:val="single" w:sz="18" w:space="6" w:color="C0C0C0"/>
-        </w:pBdr>
-        <w:shd w:val="clear" w:color="auto" w:fill="F4F4F4"/>
-      </w:pPr>
-      <w:r>
-        <w:rPr>
-          <w:rFonts w:ascii="Consolas" w:hAnsi="Consolas"/>
-          <w:sz w:val="18"/>
-          <w:szCs w:val="18"/>
-        </w:rPr>
-        <w:t xml:space="preserve">//  </w:t>
-      </w:r>
-      <w:r>
-        <w:rPr>
-          <w:rFonts w:ascii="Consolas" w:hAnsi="Consolas"/>
-          <w:sz w:val="18"/>
-          <w:szCs w:val="18"/>
-        </w:rPr>
-        <w:t>이름에</w:t>
-      </w:r>
-      <w:r>
-        <w:rPr>
-          <w:rFonts w:ascii="Consolas" w:hAnsi="Consolas"/>
-          <w:sz w:val="18"/>
-          <w:szCs w:val="18"/>
-        </w:rPr>
-        <w:t xml:space="preserve"> &lt;script&gt;...&lt;/script&gt; </w:t>
-      </w:r>
-      <w:r>
-        <w:rPr>
-          <w:rFonts w:ascii="Consolas" w:hAnsi="Consolas"/>
-          <w:sz w:val="18"/>
-          <w:szCs w:val="18"/>
-        </w:rPr>
-        <w:t>를</w:t>
-      </w:r>
-      <w:r>
-        <w:rPr>
-          <w:rFonts w:ascii="Consolas" w:hAnsi="Consolas"/>
-          <w:sz w:val="18"/>
-          <w:szCs w:val="18"/>
-        </w:rPr>
-        <w:t xml:space="preserve"> </w:t>
-      </w:r>
-      <w:r>
-        <w:rPr>
-          <w:rFonts w:ascii="Consolas" w:hAnsi="Consolas"/>
-          <w:sz w:val="18"/>
-          <w:szCs w:val="18"/>
-        </w:rPr>
-        <w:t>넣고</w:t>
-      </w:r>
-      <w:r>
-        <w:rPr>
-          <w:rFonts w:ascii="Consolas" w:hAnsi="Consolas"/>
-          <w:sz w:val="18"/>
-          <w:szCs w:val="18"/>
-        </w:rPr>
-        <w:t xml:space="preserve"> </w:t>
-      </w:r>
-      <w:r>
-        <w:rPr>
-          <w:rFonts w:ascii="Consolas" w:hAnsi="Consolas"/>
-          <w:sz w:val="18"/>
-          <w:szCs w:val="18"/>
-        </w:rPr>
-        <w:t>저장하면</w:t>
-      </w:r>
-      <w:r>
-        <w:rPr>
-          <w:rFonts w:ascii="Consolas" w:hAnsi="Consolas"/>
-          <w:sz w:val="18"/>
-          <w:szCs w:val="18"/>
-        </w:rPr>
-        <w:t xml:space="preserve">, </w:t>
-      </w:r>
-      <w:r>
-        <w:rPr>
-          <w:rFonts w:ascii="Consolas" w:hAnsi="Consolas"/>
-          <w:sz w:val="18"/>
-          <w:szCs w:val="18"/>
-        </w:rPr>
-        <w:t>이</w:t>
-      </w:r>
-      <w:r>
-        <w:rPr>
-          <w:rFonts w:ascii="Consolas" w:hAnsi="Consolas"/>
-          <w:sz w:val="18"/>
-          <w:szCs w:val="18"/>
-        </w:rPr>
-        <w:t xml:space="preserve"> </w:t>
-      </w:r>
-      <w:r>
-        <w:rPr>
-          <w:rFonts w:ascii="Consolas" w:hAnsi="Consolas"/>
-          <w:sz w:val="18"/>
-          <w:szCs w:val="18"/>
-        </w:rPr>
-        <w:t>목록</w:t>
-      </w:r>
-      <w:r>
-        <w:rPr>
-          <w:rFonts w:ascii="Consolas" w:hAnsi="Consolas"/>
-          <w:sz w:val="18"/>
-          <w:szCs w:val="18"/>
-        </w:rPr>
-        <w:t xml:space="preserve"> </w:t>
-      </w:r>
-      <w:r>
-        <w:rPr>
-          <w:rFonts w:ascii="Consolas" w:hAnsi="Consolas"/>
-          <w:sz w:val="18"/>
-          <w:szCs w:val="18"/>
-        </w:rPr>
-        <w:t>페이지를</w:t>
-      </w:r>
-      <w:r>
-        <w:rPr>
-          <w:rFonts w:ascii="Consolas" w:hAnsi="Consolas"/>
-          <w:sz w:val="18"/>
-          <w:szCs w:val="18"/>
-        </w:rPr>
-        <w:t xml:space="preserve"> </w:t>
-      </w:r>
-      <w:r>
-        <w:rPr>
-          <w:rFonts w:ascii="Consolas" w:hAnsi="Consolas"/>
-          <w:sz w:val="18"/>
-          <w:szCs w:val="18"/>
-        </w:rPr>
-        <w:t>보는</w:t>
-      </w:r>
-    </w:p>
-    <w:p>
-      <w:pPr>
-        <w:pBdr>
-          <w:left w:val="single" w:sz="18" w:space="6" w:color="C0C0C0"/>
-        </w:pBdr>
-        <w:shd w:val="clear" w:color="auto" w:fill="F4F4F4"/>
-      </w:pPr>
-      <w:r>
-        <w:rPr>
-          <w:rFonts w:ascii="Consolas" w:hAnsi="Consolas"/>
-          <w:sz w:val="18"/>
-          <w:szCs w:val="18"/>
-        </w:rPr>
-        <w:t xml:space="preserve">//  </w:t>
-      </w:r>
-      <w:r>
-        <w:rPr>
-          <w:rFonts w:ascii="Consolas" w:hAnsi="Consolas"/>
-          <w:sz w:val="18"/>
-          <w:szCs w:val="18"/>
-        </w:rPr>
-        <w:t>모든</w:t>
-      </w:r>
-      <w:r>
-        <w:rPr>
-          <w:rFonts w:ascii="Consolas" w:hAnsi="Consolas"/>
-          <w:sz w:val="18"/>
-          <w:szCs w:val="18"/>
-        </w:rPr>
-        <w:t xml:space="preserve"> </w:t>
-      </w:r>
-      <w:r>
-        <w:rPr>
-          <w:rFonts w:ascii="Consolas" w:hAnsi="Consolas"/>
-          <w:sz w:val="18"/>
-          <w:szCs w:val="18"/>
-        </w:rPr>
-        <w:t>사용자</w:t>
-      </w:r>
-      <w:r>
-        <w:rPr>
-          <w:rFonts w:ascii="Consolas" w:hAnsi="Consolas"/>
-          <w:sz w:val="18"/>
-          <w:szCs w:val="18"/>
-        </w:rPr>
-        <w:t>(</w:t>
-      </w:r>
-      <w:r>
-        <w:rPr>
-          <w:rFonts w:ascii="Consolas" w:hAnsi="Consolas"/>
-          <w:sz w:val="18"/>
-          <w:szCs w:val="18"/>
-        </w:rPr>
-        <w:t>관리자</w:t>
-      </w:r>
-      <w:r>
-        <w:rPr>
-          <w:rFonts w:ascii="Consolas" w:hAnsi="Consolas"/>
-          <w:sz w:val="18"/>
-          <w:szCs w:val="18"/>
-        </w:rPr>
-        <w:t xml:space="preserve"> </w:t>
-      </w:r>
-      <w:r>
-        <w:rPr>
-          <w:rFonts w:ascii="Consolas" w:hAnsi="Consolas"/>
-          <w:sz w:val="18"/>
-          <w:szCs w:val="18"/>
-        </w:rPr>
-        <w:t>포함</w:t>
-      </w:r>
-      <w:r>
-        <w:rPr>
-          <w:rFonts w:ascii="Consolas" w:hAnsi="Consolas"/>
-          <w:sz w:val="18"/>
-          <w:szCs w:val="18"/>
-        </w:rPr>
-        <w:t>)</w:t>
-      </w:r>
-      <w:r>
-        <w:rPr>
-          <w:rFonts w:ascii="Consolas" w:hAnsi="Consolas"/>
-          <w:sz w:val="18"/>
-          <w:szCs w:val="18"/>
-        </w:rPr>
-        <w:t>의</w:t>
-      </w:r>
-      <w:r>
-        <w:rPr>
-          <w:rFonts w:ascii="Consolas" w:hAnsi="Consolas"/>
-          <w:sz w:val="18"/>
-          <w:szCs w:val="18"/>
-        </w:rPr>
-        <w:t xml:space="preserve"> </w:t>
-      </w:r>
-      <w:r>
-        <w:rPr>
-          <w:rFonts w:ascii="Consolas" w:hAnsi="Consolas"/>
-          <w:sz w:val="18"/>
-          <w:szCs w:val="18"/>
-        </w:rPr>
-        <w:t>브라우저에서</w:t>
-      </w:r>
-      <w:r>
-        <w:rPr>
-          <w:rFonts w:ascii="Consolas" w:hAnsi="Consolas"/>
-          <w:sz w:val="18"/>
-          <w:szCs w:val="18"/>
-        </w:rPr>
-        <w:t xml:space="preserve"> </w:t>
-      </w:r>
-      <w:r>
-        <w:rPr>
-          <w:rFonts w:ascii="Consolas" w:hAnsi="Consolas"/>
-          <w:sz w:val="18"/>
-          <w:szCs w:val="18"/>
-        </w:rPr>
-        <w:t>그</w:t>
-      </w:r>
-      <w:r>
-        <w:rPr>
-          <w:rFonts w:ascii="Consolas" w:hAnsi="Consolas"/>
-          <w:sz w:val="18"/>
-          <w:szCs w:val="18"/>
-        </w:rPr>
-        <w:t xml:space="preserve"> </w:t>
-      </w:r>
-      <w:r>
-        <w:rPr>
-          <w:rFonts w:ascii="Consolas" w:hAnsi="Consolas"/>
-          <w:sz w:val="18"/>
-          <w:szCs w:val="18"/>
-        </w:rPr>
-        <w:t>스크립트가</w:t>
-      </w:r>
-      <w:r>
-        <w:rPr>
-          <w:rFonts w:ascii="Consolas" w:hAnsi="Consolas"/>
-          <w:sz w:val="18"/>
-          <w:szCs w:val="18"/>
-        </w:rPr>
-        <w:t xml:space="preserve"> </w:t>
-      </w:r>
-      <w:r>
-        <w:rPr>
-          <w:rFonts w:ascii="Consolas" w:hAnsi="Consolas"/>
-          <w:sz w:val="18"/>
-          <w:szCs w:val="18"/>
-        </w:rPr>
-        <w:t>그대로</w:t>
-      </w:r>
-      <w:r>
-        <w:rPr>
-          <w:rFonts w:ascii="Consolas" w:hAnsi="Consolas"/>
-          <w:sz w:val="18"/>
-          <w:szCs w:val="18"/>
-        </w:rPr>
-        <w:t xml:space="preserve"> </w:t>
-      </w:r>
-      <w:r>
-        <w:rPr>
-          <w:rFonts w:ascii="Consolas" w:hAnsi="Consolas"/>
-          <w:sz w:val="18"/>
-          <w:szCs w:val="18"/>
-        </w:rPr>
-        <w:t>실행된다</w:t>
-      </w:r>
-      <w:r>
-        <w:rPr>
-          <w:rFonts w:ascii="Consolas" w:hAnsi="Consolas"/>
-          <w:sz w:val="18"/>
-          <w:szCs w:val="18"/>
-        </w:rPr>
-        <w:t>.</w:t>
+        <w:t xml:space="preserve">//  모든 사용자(관리자 포함)의 브라우저에서 그 스크립트가 그대로 실행된다.</w:t>
       </w:r>
     </w:p>
     <w:p>
@@ -1525,23 +1005,39 @@
           <w:sz w:val="18"/>
           <w:szCs w:val="18"/>
         </w:rPr>
-        <w:t>&lt;!-- index.html (</w:t>
-      </w:r>
+        <w:t xml:space="preserve">&lt;!-- index.html (안전 ✅) --&gt;</w:t>
+      </w:r>
+    </w:p>
+    <w:p>
+      <w:pPr>
+        <w:pBdr>
+          <w:left w:val="single" w:sz="18" w:space="6" w:color="C0C0C0"/>
+        </w:pBdr>
+        <w:shd w:val="clear" w:color="auto" w:fill="F4F4F4"/>
+      </w:pPr>
       <w:r>
         <w:rPr>
           <w:rFonts w:ascii="Consolas" w:hAnsi="Consolas"/>
           <w:sz w:val="18"/>
           <w:szCs w:val="18"/>
         </w:rPr>
-        <w:t>안전</w:t>
-      </w:r>
+        <w:t>&lt;td th:text="${user.name}"&gt;&lt;/td&gt;</w:t>
+      </w:r>
+    </w:p>
+    <w:p>
+      <w:pPr>
+        <w:pBdr>
+          <w:left w:val="single" w:sz="18" w:space="6" w:color="C0C0C0"/>
+        </w:pBdr>
+        <w:shd w:val="clear" w:color="auto" w:fill="F4F4F4"/>
+      </w:pPr>
       <w:r>
         <w:rPr>
           <w:rFonts w:ascii="Consolas" w:hAnsi="Consolas"/>
           <w:sz w:val="18"/>
           <w:szCs w:val="18"/>
         </w:rPr>
-        <w:t xml:space="preserve"> ✅) --&gt;</w:t>
+        <w:t xml:space="preserve"> </w:t>
       </w:r>
     </w:p>
     <w:p>
@@ -1557,55 +1053,7 @@
           <w:sz w:val="18"/>
           <w:szCs w:val="18"/>
         </w:rPr>
-        <w:t>&lt;td th:text="${user.name}"&gt;&lt;/td&gt;</w:t>
-      </w:r>
-    </w:p>
-    <w:p>
-      <w:pPr>
-        <w:pBdr>
-          <w:left w:val="single" w:sz="18" w:space="6" w:color="C0C0C0"/>
-        </w:pBdr>
-        <w:shd w:val="clear" w:color="auto" w:fill="F4F4F4"/>
-      </w:pPr>
-      <w:r>
-        <w:rPr>
-          <w:rFonts w:ascii="Consolas" w:hAnsi="Consolas"/>
-          <w:sz w:val="18"/>
-          <w:szCs w:val="18"/>
-        </w:rPr>
-        <w:t xml:space="preserve"> </w:t>
-      </w:r>
-    </w:p>
-    <w:p>
-      <w:pPr>
-        <w:pBdr>
-          <w:left w:val="single" w:sz="18" w:space="6" w:color="C0C0C0"/>
-        </w:pBdr>
-        <w:shd w:val="clear" w:color="auto" w:fill="F4F4F4"/>
-      </w:pPr>
-      <w:r>
-        <w:rPr>
-          <w:rFonts w:ascii="Consolas" w:hAnsi="Consolas"/>
-          <w:sz w:val="18"/>
-          <w:szCs w:val="18"/>
-        </w:rPr>
-        <w:t>&lt;!-- index-vuln.html (</w:t>
-      </w:r>
-      <w:r>
-        <w:rPr>
-          <w:rFonts w:ascii="Consolas" w:hAnsi="Consolas"/>
-          <w:sz w:val="18"/>
-          <w:szCs w:val="18"/>
-        </w:rPr>
-        <w:t>취약</w:t>
-      </w:r>
-      <w:r>
-        <w:rPr>
-          <w:rFonts w:ascii="Consolas" w:hAnsi="Consolas"/>
-          <w:sz w:val="18"/>
-          <w:szCs w:val="18"/>
-        </w:rPr>
-        <w:t xml:space="preserve"> ⚠️) --&gt;</w:t>
+        <w:t xml:space="preserve">&lt;!-- index-vuln.html (취약 ⚠️) --&gt;</w:t>
       </w:r>
     </w:p>
     <w:p>
@@ -1644,151 +1092,7 @@
           <w:bCs/>
           <w:color w:val="2E5496"/>
         </w:rPr>
-        <w:t xml:space="preserve">2-4. </w:t>
-      </w:r>
-      <w:r>
-        <w:rPr>
-          <w:b/>
-          <w:bCs/>
-          <w:color w:val="2E5496"/>
-        </w:rPr>
-        <w:t>변경</w:t>
-      </w:r>
-      <w:r>
-        <w:rPr>
-          <w:b/>
-          <w:bCs/>
-          <w:color w:val="2E5496"/>
-        </w:rPr>
-        <w:t>/</w:t>
-      </w:r>
-      <w:r>
-        <w:rPr>
-          <w:b/>
-          <w:bCs/>
-          <w:color w:val="2E5496"/>
-        </w:rPr>
-        <w:t>추가</w:t>
-      </w:r>
-      <w:r>
-        <w:rPr>
-          <w:b/>
-          <w:bCs/>
-          <w:color w:val="2E5496"/>
-        </w:rPr>
-        <w:t xml:space="preserve"> </w:t>
-      </w:r>
-      <w:r>
-        <w:rPr>
-          <w:b/>
-          <w:bCs/>
-          <w:color w:val="2E5496"/>
-        </w:rPr>
-        <w:t>파일</w:t>
-      </w:r>
-      <w:r>
-        <w:rPr>
-          <w:b/>
-          <w:bCs/>
-          <w:color w:val="2E5496"/>
-        </w:rPr>
-        <w:t xml:space="preserve"> </w:t>
-      </w:r>
-      <w:r>
-        <w:rPr>
-          <w:b/>
-          <w:bCs/>
-          <w:color w:val="2E5496"/>
-        </w:rPr>
-        <w:t>한눈에</w:t>
-      </w:r>
-      <w:r>
-        <w:rPr>
-          <w:b/>
-          <w:bCs/>
-          <w:color w:val="2E5496"/>
-        </w:rPr>
-        <w:t xml:space="preserve"> </w:t>
-      </w:r>
-      <w:r>
-        <w:rPr>
-          <w:b/>
-          <w:bCs/>
-          <w:color w:val="2E5496"/>
-        </w:rPr>
-        <w:t>보기</w:t>
-      </w:r>
-      <w:r>
-        <w:rPr>
-          <w:b/>
-          <w:bCs/>
-          <w:color w:val="2E5496"/>
-        </w:rPr>
-        <w:t xml:space="preserve"> (</w:t>
-      </w:r>
-      <w:r>
-        <w:rPr>
-          <w:b/>
-          <w:bCs/>
-          <w:color w:val="2E5496"/>
-        </w:rPr>
-        <w:t>이</w:t>
-      </w:r>
-      <w:r>
-        <w:rPr>
-          <w:b/>
-          <w:bCs/>
-          <w:color w:val="2E5496"/>
-        </w:rPr>
-        <w:t xml:space="preserve"> </w:t>
-      </w:r>
-      <w:r>
-        <w:rPr>
-          <w:b/>
-          <w:bCs/>
-          <w:color w:val="2E5496"/>
-        </w:rPr>
-        <w:t>브랜치</w:t>
-      </w:r>
-      <w:r>
-        <w:rPr>
-          <w:b/>
-          <w:bCs/>
-          <w:color w:val="2E5496"/>
-        </w:rPr>
-        <w:t xml:space="preserve"> </w:t>
-      </w:r>
-      <w:r>
-        <w:rPr>
-          <w:b/>
-          <w:bCs/>
-          <w:color w:val="2E5496"/>
-        </w:rPr>
-        <w:t>기준</w:t>
-      </w:r>
-      <w:r>
-        <w:rPr>
-          <w:b/>
-          <w:bCs/>
-          <w:color w:val="2E5496"/>
-        </w:rPr>
-        <w:t>, 3</w:t>
-      </w:r>
-      <w:r>
-        <w:rPr>
-          <w:b/>
-          <w:bCs/>
-          <w:color w:val="2E5496"/>
-        </w:rPr>
-        <w:t>곳</w:t>
-      </w:r>
-      <w:r>
-        <w:rPr>
-          <w:b/>
-          <w:bCs/>
-          <w:color w:val="2E5496"/>
-        </w:rPr>
-        <w:t>)</w:t>
+        <w:t xml:space="preserve">2-4. 변경/추가 파일 한눈에 보기 (이 브랜치 기준, 3곳)</w:t>
       </w:r>
     </w:p>
     <w:tbl>
@@ -1881,27 +1185,7 @@
                 <w:sz w:val="18"/>
                 <w:szCs w:val="18"/>
               </w:rPr>
-              <w:t>한</w:t>
-            </w:r>
-            <w:r>
-              <w:rPr>
-                <w:b/>
-                <w:bCs/>
-                <w:color w:val="FFFFFF"/>
-                <w:sz w:val="18"/>
-                <w:szCs w:val="18"/>
-              </w:rPr>
-              <w:t xml:space="preserve"> </w:t>
-            </w:r>
-            <w:r>
-              <w:rPr>
-                <w:b/>
-                <w:bCs/>
-                <w:color w:val="FFFFFF"/>
-                <w:sz w:val="18"/>
-                <w:szCs w:val="18"/>
-              </w:rPr>
-              <w:t>일</w:t>
+              <w:t xml:space="preserve">한 일</w:t>
             </w:r>
           </w:p>
         </w:tc>
@@ -1963,126 +1247,7 @@
                 <w:sz w:val="18"/>
                 <w:szCs w:val="18"/>
               </w:rPr>
-              <w:t>/index(</w:t>
-            </w:r>
-            <w:r>
-              <w:rPr>
-                <w:sz w:val="18"/>
-                <w:szCs w:val="18"/>
-              </w:rPr>
-              <w:t>안전</w:t>
-            </w:r>
-            <w:r>
-              <w:rPr>
-                <w:sz w:val="18"/>
-                <w:szCs w:val="18"/>
-              </w:rPr>
-              <w:t>)</w:t>
-            </w:r>
-            <w:r>
-              <w:rPr>
-                <w:sz w:val="18"/>
-                <w:szCs w:val="18"/>
-              </w:rPr>
-              <w:t>에</w:t>
-            </w:r>
-            <w:r>
-              <w:rPr>
-                <w:sz w:val="18"/>
-                <w:szCs w:val="18"/>
-              </w:rPr>
-              <w:t xml:space="preserve"> </w:t>
-            </w:r>
-            <w:r>
-              <w:rPr>
-                <w:sz w:val="18"/>
-                <w:szCs w:val="18"/>
-              </w:rPr>
-              <w:t>설명</w:t>
-            </w:r>
-            <w:r>
-              <w:rPr>
-                <w:sz w:val="18"/>
-                <w:szCs w:val="18"/>
-              </w:rPr>
-              <w:t xml:space="preserve"> </w:t>
-            </w:r>
-            <w:r>
-              <w:rPr>
-                <w:sz w:val="18"/>
-                <w:szCs w:val="18"/>
-              </w:rPr>
-              <w:t>주석</w:t>
-            </w:r>
-            <w:r>
-              <w:rPr>
-                <w:sz w:val="18"/>
-                <w:szCs w:val="18"/>
-              </w:rPr>
-              <w:t xml:space="preserve"> </w:t>
-            </w:r>
-            <w:r>
-              <w:rPr>
-                <w:sz w:val="18"/>
-                <w:szCs w:val="18"/>
-              </w:rPr>
-              <w:t>추가</w:t>
-            </w:r>
-            <w:r>
-              <w:rPr>
-                <w:sz w:val="18"/>
-                <w:szCs w:val="18"/>
-              </w:rPr>
-              <w:t>, /index-vuln(</w:t>
-            </w:r>
-            <w:r>
-              <w:rPr>
-                <w:sz w:val="18"/>
-                <w:szCs w:val="18"/>
-              </w:rPr>
-              <w:t>취약</w:t>
-            </w:r>
-            <w:r>
-              <w:rPr>
-                <w:sz w:val="18"/>
-                <w:szCs w:val="18"/>
-              </w:rPr>
-              <w:t xml:space="preserve">) </w:t>
-            </w:r>
-            <w:r>
-              <w:rPr>
-                <w:sz w:val="18"/>
-                <w:szCs w:val="18"/>
-              </w:rPr>
-              <w:t>핸들러</w:t>
-            </w:r>
-            <w:r>
-              <w:rPr>
-                <w:sz w:val="18"/>
-                <w:szCs w:val="18"/>
-              </w:rPr>
-              <w:t xml:space="preserve"> </w:t>
-            </w:r>
-            <w:r>
-              <w:rPr>
-                <w:sz w:val="18"/>
-                <w:szCs w:val="18"/>
-              </w:rPr>
-              <w:t>신규</w:t>
-            </w:r>
-            <w:r>
-              <w:rPr>
-                <w:sz w:val="18"/>
-                <w:szCs w:val="18"/>
-              </w:rPr>
-              <w:t xml:space="preserve"> </w:t>
-            </w:r>
-            <w:r>
-              <w:rPr>
-                <w:sz w:val="18"/>
-                <w:szCs w:val="18"/>
-              </w:rPr>
-              <w:t>추가</w:t>
+              <w:t xml:space="preserve">/index(안전)에 설명 주석 추가, /index-vuln(취약) 핸들러 신규 추가</w:t>
             </w:r>
           </w:p>
         </w:tc>
@@ -2144,105 +1309,7 @@
                 <w:sz w:val="18"/>
                 <w:szCs w:val="18"/>
               </w:rPr>
-              <w:t>취약</w:t>
-            </w:r>
-            <w:r>
-              <w:rPr>
-                <w:sz w:val="18"/>
-                <w:szCs w:val="18"/>
-              </w:rPr>
-              <w:t xml:space="preserve"> </w:t>
-            </w:r>
-            <w:r>
-              <w:rPr>
-                <w:sz w:val="18"/>
-                <w:szCs w:val="18"/>
-              </w:rPr>
-              <w:t>데모</w:t>
-            </w:r>
-            <w:r>
-              <w:rPr>
-                <w:sz w:val="18"/>
-                <w:szCs w:val="18"/>
-              </w:rPr>
-              <w:t xml:space="preserve"> </w:t>
-            </w:r>
-            <w:r>
-              <w:rPr>
-                <w:sz w:val="18"/>
-                <w:szCs w:val="18"/>
-              </w:rPr>
-              <w:t>페이지로</w:t>
-            </w:r>
-            <w:r>
-              <w:rPr>
-                <w:sz w:val="18"/>
-                <w:szCs w:val="18"/>
-              </w:rPr>
-              <w:t xml:space="preserve"> </w:t>
-            </w:r>
-            <w:r>
-              <w:rPr>
-                <w:sz w:val="18"/>
-                <w:szCs w:val="18"/>
-              </w:rPr>
-              <w:t>이동하는</w:t>
-            </w:r>
-            <w:r>
-              <w:rPr>
-                <w:sz w:val="18"/>
-                <w:szCs w:val="18"/>
-              </w:rPr>
-              <w:t xml:space="preserve"> "XSS </w:t>
-            </w:r>
-            <w:r>
-              <w:rPr>
-                <w:sz w:val="18"/>
-                <w:szCs w:val="18"/>
-              </w:rPr>
-              <w:t>데모</w:t>
-            </w:r>
-            <w:r>
-              <w:rPr>
-                <w:sz w:val="18"/>
-                <w:szCs w:val="18"/>
-              </w:rPr>
-              <w:t>(</w:t>
-            </w:r>
-            <w:r>
-              <w:rPr>
-                <w:sz w:val="18"/>
-                <w:szCs w:val="18"/>
-              </w:rPr>
-              <w:t>취약</w:t>
-            </w:r>
-            <w:r>
-              <w:rPr>
-                <w:sz w:val="18"/>
-                <w:szCs w:val="18"/>
-              </w:rPr>
-              <w:t xml:space="preserve">)" </w:t>
-            </w:r>
-            <w:r>
-              <w:rPr>
-                <w:sz w:val="18"/>
-                <w:szCs w:val="18"/>
-              </w:rPr>
-              <w:t>링크</w:t>
-            </w:r>
-            <w:r>
-              <w:rPr>
-                <w:sz w:val="18"/>
-                <w:szCs w:val="18"/>
-              </w:rPr>
-              <w:t xml:space="preserve"> </w:t>
-            </w:r>
-            <w:r>
-              <w:rPr>
-                <w:sz w:val="18"/>
-                <w:szCs w:val="18"/>
-              </w:rPr>
-              <w:t>추가</w:t>
+              <w:t xml:space="preserve">취약 데모 페이지로 이동하는 "XSS 데모(취약)" 링크 추가</w:t>
             </w:r>
           </w:p>
         </w:tc>
@@ -2304,91 +1371,7 @@
                 <w:sz w:val="18"/>
                 <w:szCs w:val="18"/>
               </w:rPr>
-              <w:t>th:utext</w:t>
-            </w:r>
-            <w:r>
-              <w:rPr>
-                <w:sz w:val="18"/>
-                <w:szCs w:val="18"/>
-              </w:rPr>
-              <w:t>로</w:t>
-            </w:r>
-            <w:r>
-              <w:rPr>
-                <w:sz w:val="18"/>
-                <w:szCs w:val="18"/>
-              </w:rPr>
-              <w:t xml:space="preserve"> </w:t>
-            </w:r>
-            <w:r>
-              <w:rPr>
-                <w:sz w:val="18"/>
-                <w:szCs w:val="18"/>
-              </w:rPr>
-              <w:t>렌더링하는</w:t>
-            </w:r>
-            <w:r>
-              <w:rPr>
-                <w:sz w:val="18"/>
-                <w:szCs w:val="18"/>
-              </w:rPr>
-              <w:t xml:space="preserve"> </w:t>
-            </w:r>
-            <w:r>
-              <w:rPr>
-                <w:sz w:val="18"/>
-                <w:szCs w:val="18"/>
-              </w:rPr>
-              <w:t>취약</w:t>
-            </w:r>
-            <w:r>
-              <w:rPr>
-                <w:sz w:val="18"/>
-                <w:szCs w:val="18"/>
-              </w:rPr>
-              <w:t xml:space="preserve"> </w:t>
-            </w:r>
-            <w:r>
-              <w:rPr>
-                <w:sz w:val="18"/>
-                <w:szCs w:val="18"/>
-              </w:rPr>
-              <w:t>템플릿</w:t>
-            </w:r>
-            <w:r>
-              <w:rPr>
-                <w:sz w:val="18"/>
-                <w:szCs w:val="18"/>
-              </w:rPr>
-              <w:t>(</w:t>
-            </w:r>
-            <w:r>
-              <w:rPr>
-                <w:sz w:val="18"/>
-                <w:szCs w:val="18"/>
-              </w:rPr>
-              <w:t>신규</w:t>
-            </w:r>
-            <w:r>
-              <w:rPr>
-                <w:sz w:val="18"/>
-                <w:szCs w:val="18"/>
-              </w:rPr>
-              <w:t xml:space="preserve"> </w:t>
-            </w:r>
-            <w:r>
-              <w:rPr>
-                <w:sz w:val="18"/>
-                <w:szCs w:val="18"/>
-              </w:rPr>
-              <w:t>파일</w:t>
-            </w:r>
-            <w:r>
-              <w:rPr>
-                <w:sz w:val="18"/>
-                <w:szCs w:val="18"/>
-              </w:rPr>
-              <w:t>)</w:t>
+              <w:t xml:space="preserve">th:utext로 렌더링하는 취약 템플릿(신규 파일)</w:t>
             </w:r>
           </w:p>
         </w:tc>
@@ -2399,31 +1382,7 @@
         <w:spacing w:after="80" w:line="272" w:lineRule="auto"/>
       </w:pPr>
       <w:r>
-        <w:t>index.html</w:t>
-      </w:r>
-      <w:r>
-        <w:t>에</w:t>
-      </w:r>
-      <w:r>
-        <w:t xml:space="preserve"> </w:t>
-      </w:r>
-      <w:r>
-        <w:t>추가된</w:t>
-      </w:r>
-      <w:r>
-        <w:t xml:space="preserve"> </w:t>
-      </w:r>
-      <w:r>
-        <w:t>두</w:t>
-      </w:r>
-      <w:r>
-        <w:t xml:space="preserve"> </w:t>
-      </w:r>
-      <w:r>
-        <w:t>줄</w:t>
-      </w:r>
-      <w:r>
-        <w:t>:</w:t>
+        <w:t xml:space="preserve">index.html에 추가된 두 줄:</w:t>
       </w:r>
     </w:p>
     <w:p>
@@ -2440,48 +1399,107 @@
           <w:sz w:val="16"/>
           <w:szCs w:val="16"/>
         </w:rPr>
-        <w:t>&lt;!-- [</w:t>
-      </w:r>
+        <w:t xml:space="preserve">&lt;!-- [교육용] XSS(Stored) 공격 재현 전용 페이지로 이동 --&gt;</w:t>
+      </w:r>
+    </w:p>
+    <w:p>
+      <w:pPr>
+        <w:pBdr>
+          <w:left w:val="single" w:sz="18" w:space="6" w:color="C0C0C0"/>
+          <w:bottom w:val="single" w:sz="4" w:space="3" w:color="D9D9D9"/>
+        </w:pBdr>
+        <w:shd w:val="clear" w:color="auto" w:fill="F4F4F4"/>
+      </w:pPr>
       <w:r>
         <w:rPr>
           <w:rFonts w:ascii="Consolas" w:hAnsi="Consolas"/>
           <w:sz w:val="16"/>
           <w:szCs w:val="16"/>
         </w:rPr>
-        <w:t>교육용</w:t>
-      </w:r>
+        <w:lastRenderedPageBreak/>
+        <w:t xml:space="preserve">&lt;a href="/users/index-vuln" class="btn btn-outline-danger"&gt;XSS 데모(취약)&lt;/a&gt;</w:t>
+      </w:r>
+    </w:p>
+    <w:p>
+      <w:pPr>
+        <w:spacing w:after="80" w:line="272" w:lineRule="auto"/>
+      </w:pPr>
+      <w:r>
+        <w:t xml:space="preserve">index-vuln.html(신규 파일)의 핵심만 보면 — 안전한 index.html과 구조는 동일하고(표·Edit·Delete·네비게이션 버튼 등 그대로), 실제로 다른 부분은 딱 두 곳이다:</w:t>
+      </w:r>
+    </w:p>
+    <w:p>
+      <w:pPr>
+        <w:pBdr>
+          <w:top w:val="single" w:sz="4" w:space="3" w:color="D9D9D9"/>
+          <w:left w:val="single" w:sz="18" w:space="6" w:color="C0C0C0"/>
+        </w:pBdr>
+        <w:shd w:val="clear" w:color="auto" w:fill="F4F4F4"/>
+      </w:pPr>
       <w:r>
         <w:rPr>
           <w:rFonts w:ascii="Consolas" w:hAnsi="Consolas"/>
           <w:sz w:val="16"/>
           <w:szCs w:val="16"/>
         </w:rPr>
-        <w:t xml:space="preserve">] XSS(Stored) </w:t>
-      </w:r>
+        <w:t xml:space="preserve">&lt;!-- 상단 경고 배너(신규) --&gt;</w:t>
+      </w:r>
+    </w:p>
+    <w:p>
+      <w:pPr>
+        <w:pBdr>
+          <w:left w:val="single" w:sz="18" w:space="6" w:color="C0C0C0"/>
+        </w:pBdr>
+        <w:shd w:val="clear" w:color="auto" w:fill="F4F4F4"/>
+      </w:pPr>
       <w:r>
         <w:rPr>
           <w:rFonts w:ascii="Consolas" w:hAnsi="Consolas"/>
           <w:sz w:val="16"/>
           <w:szCs w:val="16"/>
         </w:rPr>
-        <w:t>공격</w:t>
-      </w:r>
+        <w:t>&lt;div class="alert alert-danger" role="alert"&gt;</w:t>
+      </w:r>
+    </w:p>
+    <w:p>
+      <w:pPr>
+        <w:pBdr>
+          <w:left w:val="single" w:sz="18" w:space="6" w:color="C0C0C0"/>
+        </w:pBdr>
+        <w:shd w:val="clear" w:color="auto" w:fill="F4F4F4"/>
+      </w:pPr>
       <w:r>
         <w:rPr>
           <w:rFonts w:ascii="Consolas" w:hAnsi="Consolas"/>
           <w:sz w:val="16"/>
           <w:szCs w:val="16"/>
         </w:rPr>
-        <w:t xml:space="preserve"> </w:t>
-      </w:r>
+        <w:t xml:space="preserve">    XSS 취약 데모 페이지 — 아래 Name 컬럼은 &lt;code&gt;th:utext&lt;/code&gt;(이스케이프 없음)로 렌더링된다. ...</w:t>
+      </w:r>
+    </w:p>
+    <w:p>
+      <w:pPr>
+        <w:pBdr>
+          <w:left w:val="single" w:sz="18" w:space="6" w:color="C0C0C0"/>
+        </w:pBdr>
+        <w:shd w:val="clear" w:color="auto" w:fill="F4F4F4"/>
+      </w:pPr>
       <w:r>
         <w:rPr>
           <w:rFonts w:ascii="Consolas" w:hAnsi="Consolas"/>
           <w:sz w:val="16"/>
           <w:szCs w:val="16"/>
         </w:rPr>
-        <w:t>재현</w:t>
-      </w:r>
+        <w:t>&lt;/div&gt;</w:t>
+      </w:r>
+    </w:p>
+    <w:p>
+      <w:pPr>
+        <w:pBdr>
+          <w:left w:val="single" w:sz="18" w:space="6" w:color="C0C0C0"/>
+        </w:pBdr>
+        <w:shd w:val="clear" w:color="auto" w:fill="F4F4F4"/>
+      </w:pPr>
       <w:r>
         <w:rPr>
           <w:rFonts w:ascii="Consolas" w:hAnsi="Consolas"/>
@@ -2490,634 +1508,23 @@
         </w:rPr>
         <w:t xml:space="preserve"> </w:t>
       </w:r>
+      <w:bookmarkStart w:id="0" w:name="_GoBack"/>
+      <w:bookmarkEnd w:id="0"/>
+    </w:p>
+    <w:p>
+      <w:pPr>
+        <w:pBdr>
+          <w:left w:val="single" w:sz="18" w:space="6" w:color="C0C0C0"/>
+        </w:pBdr>
+        <w:shd w:val="clear" w:color="auto" w:fill="F4F4F4"/>
+      </w:pPr>
       <w:r>
         <w:rPr>
           <w:rFonts w:ascii="Consolas" w:hAnsi="Consolas"/>
           <w:sz w:val="16"/>
           <w:szCs w:val="16"/>
         </w:rPr>
-        <w:t>전용</w:t>
-      </w:r>
-      <w:r>
-        <w:rPr>
-          <w:rFonts w:ascii="Consolas" w:hAnsi="Consolas"/>
-          <w:sz w:val="16"/>
-          <w:szCs w:val="16"/>
-        </w:rPr>
-        <w:t xml:space="preserve"> </w:t>
-      </w:r>
-      <w:r>
-        <w:rPr>
-          <w:rFonts w:ascii="Consolas" w:hAnsi="Consolas"/>
-          <w:sz w:val="16"/>
-          <w:szCs w:val="16"/>
-        </w:rPr>
-        <w:t>페이지로</w:t>
-      </w:r>
-      <w:r>
-        <w:rPr>
-          <w:rFonts w:ascii="Consolas" w:hAnsi="Consolas"/>
-          <w:sz w:val="16"/>
-          <w:szCs w:val="16"/>
-        </w:rPr>
-        <w:t xml:space="preserve"> </w:t>
-      </w:r>
-      <w:r>
-        <w:rPr>
-          <w:rFonts w:ascii="Consolas" w:hAnsi="Consolas"/>
-          <w:sz w:val="16"/>
-          <w:szCs w:val="16"/>
-        </w:rPr>
-        <w:t>이동</w:t>
-      </w:r>
-      <w:r>
-        <w:rPr>
-          <w:rFonts w:ascii="Consolas" w:hAnsi="Consolas"/>
-          <w:sz w:val="16"/>
-          <w:szCs w:val="16"/>
-        </w:rPr>
-        <w:t xml:space="preserve"> --&gt;</w:t>
-      </w:r>
-    </w:p>
-    <w:p>
-      <w:pPr>
-        <w:pBdr>
-          <w:left w:val="single" w:sz="18" w:space="6" w:color="C0C0C0"/>
-          <w:bottom w:val="single" w:sz="4" w:space="3" w:color="D9D9D9"/>
-        </w:pBdr>
-        <w:shd w:val="clear" w:color="auto" w:fill="F4F4F4"/>
-      </w:pPr>
-      <w:r>
-        <w:rPr>
-          <w:rFonts w:ascii="Consolas" w:hAnsi="Consolas"/>
-          <w:sz w:val="16"/>
-          <w:szCs w:val="16"/>
-        </w:rPr>
-        <w:lastRenderedPageBreak/>
-        <w:t xml:space="preserve">&lt;a href="/users/index-vuln" class="btn btn-outline-danger"&gt;XSS </w:t>
-      </w:r>
-      <w:r>
-        <w:rPr>
-          <w:rFonts w:ascii="Consolas" w:hAnsi="Consolas"/>
-          <w:sz w:val="16"/>
-          <w:szCs w:val="16"/>
-        </w:rPr>
-        <w:t>데모</w:t>
-      </w:r>
-      <w:r>
-        <w:rPr>
-          <w:rFonts w:ascii="Consolas" w:hAnsi="Consolas"/>
-          <w:sz w:val="16"/>
-          <w:szCs w:val="16"/>
-        </w:rPr>
-        <w:t>(</w:t>
-      </w:r>
-      <w:r>
-        <w:rPr>
-          <w:rFonts w:ascii="Consolas" w:hAnsi="Consolas"/>
-          <w:sz w:val="16"/>
-          <w:szCs w:val="16"/>
-        </w:rPr>
-        <w:t>취약</w:t>
-      </w:r>
-      <w:r>
-        <w:rPr>
-          <w:rFonts w:ascii="Consolas" w:hAnsi="Consolas"/>
-          <w:sz w:val="16"/>
-          <w:szCs w:val="16"/>
-        </w:rPr>
-        <w:t>)&lt;/a&gt;</w:t>
-      </w:r>
-    </w:p>
-    <w:p>
-      <w:pPr>
-        <w:spacing w:after="80" w:line="272" w:lineRule="auto"/>
-      </w:pPr>
-      <w:r>
-        <w:t>index-vuln.html(</w:t>
-      </w:r>
-      <w:r>
-        <w:t>신규</w:t>
-      </w:r>
-      <w:r>
-        <w:t xml:space="preserve"> </w:t>
-      </w:r>
-      <w:r>
-        <w:t>파일</w:t>
-      </w:r>
-      <w:r>
-        <w:t>)</w:t>
-      </w:r>
-      <w:r>
-        <w:t>의</w:t>
-      </w:r>
-      <w:r>
-        <w:t xml:space="preserve"> </w:t>
-      </w:r>
-      <w:r>
-        <w:t>핵심만</w:t>
-      </w:r>
-      <w:r>
-        <w:t xml:space="preserve"> </w:t>
-      </w:r>
-      <w:r>
-        <w:t>보면</w:t>
-      </w:r>
-      <w:r>
-        <w:t xml:space="preserve"> — </w:t>
-      </w:r>
-      <w:r>
-        <w:t>안전한</w:t>
-      </w:r>
-      <w:r>
-        <w:t xml:space="preserve"> index.html</w:t>
-      </w:r>
-      <w:r>
-        <w:t>과</w:t>
-      </w:r>
-      <w:r>
-        <w:t xml:space="preserve"> </w:t>
-      </w:r>
-      <w:r>
-        <w:t>구조는</w:t>
-      </w:r>
-      <w:r>
-        <w:t xml:space="preserve"> </w:t>
-      </w:r>
-      <w:r>
-        <w:t>동일하고</w:t>
-      </w:r>
-      <w:r>
-        <w:t>(</w:t>
-      </w:r>
-      <w:r>
-        <w:t>표</w:t>
-      </w:r>
-      <w:r>
-        <w:t>·Edit·Delete·</w:t>
-      </w:r>
-      <w:r>
-        <w:t>네비게이션</w:t>
-      </w:r>
-      <w:r>
-        <w:t xml:space="preserve"> </w:t>
-      </w:r>
-      <w:r>
-        <w:t>버튼</w:t>
-      </w:r>
-      <w:r>
-        <w:t xml:space="preserve"> </w:t>
-      </w:r>
-      <w:r>
-        <w:t>등</w:t>
-      </w:r>
-      <w:r>
-        <w:t xml:space="preserve"> </w:t>
-      </w:r>
-      <w:r>
-        <w:t>그대로</w:t>
-      </w:r>
-      <w:r>
-        <w:t xml:space="preserve">), </w:t>
-      </w:r>
-      <w:r>
-        <w:t>실제로</w:t>
-      </w:r>
-      <w:r>
-        <w:t xml:space="preserve"> </w:t>
-      </w:r>
-      <w:r>
-        <w:t>다른</w:t>
-      </w:r>
-      <w:r>
-        <w:t xml:space="preserve"> </w:t>
-      </w:r>
-      <w:r>
-        <w:t>부분은</w:t>
-      </w:r>
-      <w:r>
-        <w:t xml:space="preserve"> </w:t>
-      </w:r>
-      <w:r>
-        <w:t>딱</w:t>
-      </w:r>
-      <w:r>
-        <w:t xml:space="preserve"> </w:t>
-      </w:r>
-      <w:r>
-        <w:t>두</w:t>
-      </w:r>
-      <w:r>
-        <w:t xml:space="preserve"> </w:t>
-      </w:r>
-      <w:r>
-        <w:t>곳이다</w:t>
-      </w:r>
-      <w:r>
-        <w:t>:</w:t>
-      </w:r>
-    </w:p>
-    <w:p>
-      <w:pPr>
-        <w:pBdr>
-          <w:top w:val="single" w:sz="4" w:space="3" w:color="D9D9D9"/>
-          <w:left w:val="single" w:sz="18" w:space="6" w:color="C0C0C0"/>
-        </w:pBdr>
-        <w:shd w:val="clear" w:color="auto" w:fill="F4F4F4"/>
-      </w:pPr>
-      <w:r>
-        <w:rPr>
-          <w:rFonts w:ascii="Consolas" w:hAnsi="Consolas"/>
-          <w:sz w:val="16"/>
-          <w:szCs w:val="16"/>
-        </w:rPr>
-        <w:t xml:space="preserve">&lt;!-- </w:t>
-      </w:r>
-      <w:r>
-        <w:rPr>
-          <w:rFonts w:ascii="Consolas" w:hAnsi="Consolas"/>
-          <w:sz w:val="16"/>
-          <w:szCs w:val="16"/>
-        </w:rPr>
-        <w:t>상단</w:t>
-      </w:r>
-      <w:r>
-        <w:rPr>
-          <w:rFonts w:ascii="Consolas" w:hAnsi="Consolas"/>
-          <w:sz w:val="16"/>
-          <w:szCs w:val="16"/>
-        </w:rPr>
-        <w:t xml:space="preserve"> </w:t>
-      </w:r>
-      <w:r>
-        <w:rPr>
-          <w:rFonts w:ascii="Consolas" w:hAnsi="Consolas"/>
-          <w:sz w:val="16"/>
-          <w:szCs w:val="16"/>
-        </w:rPr>
-        <w:t>경고</w:t>
-      </w:r>
-      <w:r>
-        <w:rPr>
-          <w:rFonts w:ascii="Consolas" w:hAnsi="Consolas"/>
-          <w:sz w:val="16"/>
-          <w:szCs w:val="16"/>
-        </w:rPr>
-        <w:t xml:space="preserve"> </w:t>
-      </w:r>
-      <w:r>
-        <w:rPr>
-          <w:rFonts w:ascii="Consolas" w:hAnsi="Consolas"/>
-          <w:sz w:val="16"/>
-          <w:szCs w:val="16"/>
-        </w:rPr>
-        <w:t>배너</w:t>
-      </w:r>
-      <w:r>
-        <w:rPr>
-          <w:rFonts w:ascii="Consolas" w:hAnsi="Consolas"/>
-          <w:sz w:val="16"/>
-          <w:szCs w:val="16"/>
-        </w:rPr>
-        <w:t>(</w:t>
-      </w:r>
-      <w:r>
-        <w:rPr>
-          <w:rFonts w:ascii="Consolas" w:hAnsi="Consolas"/>
-          <w:sz w:val="16"/>
-          <w:szCs w:val="16"/>
-        </w:rPr>
-        <w:t>신규</w:t>
-      </w:r>
-      <w:r>
-        <w:rPr>
-          <w:rFonts w:ascii="Consolas" w:hAnsi="Consolas"/>
-          <w:sz w:val="16"/>
-          <w:szCs w:val="16"/>
-        </w:rPr>
-        <w:t>) --&gt;</w:t>
-      </w:r>
-    </w:p>
-    <w:p>
-      <w:pPr>
-        <w:pBdr>
-          <w:left w:val="single" w:sz="18" w:space="6" w:color="C0C0C0"/>
-        </w:pBdr>
-        <w:shd w:val="clear" w:color="auto" w:fill="F4F4F4"/>
-      </w:pPr>
-      <w:r>
-        <w:rPr>
-          <w:rFonts w:ascii="Consolas" w:hAnsi="Consolas"/>
-          <w:sz w:val="16"/>
-          <w:szCs w:val="16"/>
-        </w:rPr>
-        <w:t>&lt;div class="alert alert-danger" role="alert"&gt;</w:t>
-      </w:r>
-    </w:p>
-    <w:p>
-      <w:pPr>
-        <w:pBdr>
-          <w:left w:val="single" w:sz="18" w:space="6" w:color="C0C0C0"/>
-        </w:pBdr>
-        <w:shd w:val="clear" w:color="auto" w:fill="F4F4F4"/>
-      </w:pPr>
-      <w:r>
-        <w:rPr>
-          <w:rFonts w:ascii="Consolas" w:hAnsi="Consolas"/>
-          <w:sz w:val="16"/>
-          <w:szCs w:val="16"/>
-        </w:rPr>
-        <w:t xml:space="preserve">    XSS </w:t>
-      </w:r>
-      <w:r>
-        <w:rPr>
-          <w:rFonts w:ascii="Consolas" w:hAnsi="Consolas"/>
-          <w:sz w:val="16"/>
-          <w:szCs w:val="16"/>
-        </w:rPr>
-        <w:t>취약</w:t>
-      </w:r>
-      <w:r>
-        <w:rPr>
-          <w:rFonts w:ascii="Consolas" w:hAnsi="Consolas"/>
-          <w:sz w:val="16"/>
-          <w:szCs w:val="16"/>
-        </w:rPr>
-        <w:t xml:space="preserve"> </w:t>
-      </w:r>
-      <w:r>
-        <w:rPr>
-          <w:rFonts w:ascii="Consolas" w:hAnsi="Consolas"/>
-          <w:sz w:val="16"/>
-          <w:szCs w:val="16"/>
-        </w:rPr>
-        <w:t>데모</w:t>
-      </w:r>
-      <w:r>
-        <w:rPr>
-          <w:rFonts w:ascii="Consolas" w:hAnsi="Consolas"/>
-          <w:sz w:val="16"/>
-          <w:szCs w:val="16"/>
-        </w:rPr>
-        <w:t xml:space="preserve"> </w:t>
-      </w:r>
-      <w:r>
-        <w:rPr>
-          <w:rFonts w:ascii="Consolas" w:hAnsi="Consolas"/>
-          <w:sz w:val="16"/>
-          <w:szCs w:val="16"/>
-        </w:rPr>
-        <w:t>페이지</w:t>
-      </w:r>
-      <w:r>
-        <w:rPr>
-          <w:rFonts w:ascii="Consolas" w:hAnsi="Consolas"/>
-          <w:sz w:val="16"/>
-          <w:szCs w:val="16"/>
-        </w:rPr>
-        <w:t xml:space="preserve"> — </w:t>
-      </w:r>
-      <w:r>
-        <w:rPr>
-          <w:rFonts w:ascii="Consolas" w:hAnsi="Consolas"/>
-          <w:sz w:val="16"/>
-          <w:szCs w:val="16"/>
-        </w:rPr>
-        <w:t>아래</w:t>
-      </w:r>
-      <w:r>
-        <w:rPr>
-          <w:rFonts w:ascii="Consolas" w:hAnsi="Consolas"/>
-          <w:sz w:val="16"/>
-          <w:szCs w:val="16"/>
-        </w:rPr>
-        <w:t xml:space="preserve"> Name </w:t>
-      </w:r>
-      <w:r>
-        <w:rPr>
-          <w:rFonts w:ascii="Consolas" w:hAnsi="Consolas"/>
-          <w:sz w:val="16"/>
-          <w:szCs w:val="16"/>
-        </w:rPr>
-        <w:t>컬럼은</w:t>
-      </w:r>
-      <w:r>
-        <w:rPr>
-          <w:rFonts w:ascii="Consolas" w:hAnsi="Consolas"/>
-          <w:sz w:val="16"/>
-          <w:szCs w:val="16"/>
-        </w:rPr>
-        <w:t xml:space="preserve"> &lt;code&gt;th:utext&lt;/code&gt;(</w:t>
-      </w:r>
-      <w:r>
-        <w:rPr>
-          <w:rFonts w:ascii="Consolas" w:hAnsi="Consolas"/>
-          <w:sz w:val="16"/>
-          <w:szCs w:val="16"/>
-        </w:rPr>
-        <w:t>이스케이프</w:t>
-      </w:r>
-      <w:r>
-        <w:rPr>
-          <w:rFonts w:ascii="Consolas" w:hAnsi="Consolas"/>
-          <w:sz w:val="16"/>
-          <w:szCs w:val="16"/>
-        </w:rPr>
-        <w:t xml:space="preserve"> </w:t>
-      </w:r>
-      <w:r>
-        <w:rPr>
-          <w:rFonts w:ascii="Consolas" w:hAnsi="Consolas"/>
-          <w:sz w:val="16"/>
-          <w:szCs w:val="16"/>
-        </w:rPr>
-        <w:t>없음</w:t>
-      </w:r>
-      <w:r>
-        <w:rPr>
-          <w:rFonts w:ascii="Consolas" w:hAnsi="Consolas"/>
-          <w:sz w:val="16"/>
-          <w:szCs w:val="16"/>
-        </w:rPr>
-        <w:t>)</w:t>
-      </w:r>
-      <w:r>
-        <w:rPr>
-          <w:rFonts w:ascii="Consolas" w:hAnsi="Consolas"/>
-          <w:sz w:val="16"/>
-          <w:szCs w:val="16"/>
-        </w:rPr>
-        <w:t>로</w:t>
-      </w:r>
-      <w:r>
-        <w:rPr>
-          <w:rFonts w:ascii="Consolas" w:hAnsi="Consolas"/>
-          <w:sz w:val="16"/>
-          <w:szCs w:val="16"/>
-        </w:rPr>
-        <w:t xml:space="preserve"> </w:t>
-      </w:r>
-      <w:r>
-        <w:rPr>
-          <w:rFonts w:ascii="Consolas" w:hAnsi="Consolas"/>
-          <w:sz w:val="16"/>
-          <w:szCs w:val="16"/>
-        </w:rPr>
-        <w:t>렌더링된다</w:t>
-      </w:r>
-      <w:r>
-        <w:rPr>
-          <w:rFonts w:ascii="Consolas" w:hAnsi="Consolas"/>
-          <w:sz w:val="16"/>
-          <w:szCs w:val="16"/>
-        </w:rPr>
-        <w:t>. ...</w:t>
-      </w:r>
-    </w:p>
-    <w:p>
-      <w:pPr>
-        <w:pBdr>
-          <w:left w:val="single" w:sz="18" w:space="6" w:color="C0C0C0"/>
-        </w:pBdr>
-        <w:shd w:val="clear" w:color="auto" w:fill="F4F4F4"/>
-      </w:pPr>
-      <w:r>
-        <w:rPr>
-          <w:rFonts w:ascii="Consolas" w:hAnsi="Consolas"/>
-          <w:sz w:val="16"/>
-          <w:szCs w:val="16"/>
-        </w:rPr>
-        <w:t>&lt;/div&gt;</w:t>
-      </w:r>
-    </w:p>
-    <w:p>
-      <w:pPr>
-        <w:pBdr>
-          <w:left w:val="single" w:sz="18" w:space="6" w:color="C0C0C0"/>
-        </w:pBdr>
-        <w:shd w:val="clear" w:color="auto" w:fill="F4F4F4"/>
-      </w:pPr>
-      <w:r>
-        <w:rPr>
-          <w:rFonts w:ascii="Consolas" w:hAnsi="Consolas"/>
-          <w:sz w:val="16"/>
-          <w:szCs w:val="16"/>
-        </w:rPr>
-        <w:t xml:space="preserve"> </w:t>
-      </w:r>
-      <w:bookmarkStart w:id="0" w:name="_GoBack"/>
-      <w:bookmarkEnd w:id="0"/>
-    </w:p>
-    <w:p>
-      <w:pPr>
-        <w:pBdr>
-          <w:left w:val="single" w:sz="18" w:space="6" w:color="C0C0C0"/>
-        </w:pBdr>
-        <w:shd w:val="clear" w:color="auto" w:fill="F4F4F4"/>
-      </w:pPr>
-      <w:r>
-        <w:rPr>
-          <w:rFonts w:ascii="Consolas" w:hAnsi="Consolas"/>
-          <w:sz w:val="16"/>
-          <w:szCs w:val="16"/>
-        </w:rPr>
-        <w:t xml:space="preserve">&lt;!-- Name </w:t>
-      </w:r>
-      <w:r>
-        <w:rPr>
-          <w:rFonts w:ascii="Consolas" w:hAnsi="Consolas"/>
-          <w:sz w:val="16"/>
-          <w:szCs w:val="16"/>
-        </w:rPr>
-        <w:t>컬럼</w:t>
-      </w:r>
-      <w:r>
-        <w:rPr>
-          <w:rFonts w:ascii="Consolas" w:hAnsi="Consolas"/>
-          <w:sz w:val="16"/>
-          <w:szCs w:val="16"/>
-        </w:rPr>
-        <w:t xml:space="preserve"> </w:t>
-      </w:r>
-      <w:r>
-        <w:rPr>
-          <w:rFonts w:ascii="Consolas" w:hAnsi="Consolas"/>
-          <w:sz w:val="16"/>
-          <w:szCs w:val="16"/>
-        </w:rPr>
-        <w:t>렌더링</w:t>
-      </w:r>
-      <w:r>
-        <w:rPr>
-          <w:rFonts w:ascii="Consolas" w:hAnsi="Consolas"/>
-          <w:sz w:val="16"/>
-          <w:szCs w:val="16"/>
-        </w:rPr>
-        <w:t>(2-3</w:t>
-      </w:r>
-      <w:r>
-        <w:rPr>
-          <w:rFonts w:ascii="Consolas" w:hAnsi="Consolas"/>
-          <w:sz w:val="16"/>
-          <w:szCs w:val="16"/>
-        </w:rPr>
-        <w:t>에서</w:t>
-      </w:r>
-      <w:r>
-        <w:rPr>
-          <w:rFonts w:ascii="Consolas" w:hAnsi="Consolas"/>
-          <w:sz w:val="16"/>
-          <w:szCs w:val="16"/>
-        </w:rPr>
-        <w:t xml:space="preserve"> </w:t>
-      </w:r>
-      <w:r>
-        <w:rPr>
-          <w:rFonts w:ascii="Consolas" w:hAnsi="Consolas"/>
-          <w:sz w:val="16"/>
-          <w:szCs w:val="16"/>
-        </w:rPr>
-        <w:t>본</w:t>
-      </w:r>
-      <w:r>
-        <w:rPr>
-          <w:rFonts w:ascii="Consolas" w:hAnsi="Consolas"/>
-          <w:sz w:val="16"/>
-          <w:szCs w:val="16"/>
-        </w:rPr>
-        <w:t xml:space="preserve"> </w:t>
-      </w:r>
-      <w:r>
-        <w:rPr>
-          <w:rFonts w:ascii="Consolas" w:hAnsi="Consolas"/>
-          <w:sz w:val="16"/>
-          <w:szCs w:val="16"/>
-        </w:rPr>
-        <w:t>핵심</w:t>
-      </w:r>
-      <w:r>
-        <w:rPr>
-          <w:rFonts w:ascii="Consolas" w:hAnsi="Consolas"/>
-          <w:sz w:val="16"/>
-          <w:szCs w:val="16"/>
-        </w:rPr>
-        <w:t xml:space="preserve"> </w:t>
-      </w:r>
-      <w:r>
-        <w:rPr>
-          <w:rFonts w:ascii="Consolas" w:hAnsi="Consolas"/>
-          <w:sz w:val="16"/>
-          <w:szCs w:val="16"/>
-        </w:rPr>
-        <w:t>차이</w:t>
-      </w:r>
-      <w:r>
-        <w:rPr>
-          <w:rFonts w:ascii="Consolas" w:hAnsi="Consolas"/>
-          <w:sz w:val="16"/>
-          <w:szCs w:val="16"/>
-        </w:rPr>
-        <w:t>) --&gt;</w:t>
+        <w:t xml:space="preserve">&lt;!-- Name 컬럼 렌더링(2-3에서 본 핵심 차이) --&gt;</w:t>
       </w:r>
     </w:p>
     <w:p>
@@ -3159,82 +1566,7 @@
         <w:spacing w:after="80" w:line="272" w:lineRule="auto"/>
       </w:pPr>
       <w:r>
-        <w:t>나머지</w:t>
-      </w:r>
-      <w:r>
-        <w:t xml:space="preserve">(Email </w:t>
-      </w:r>
-      <w:r>
-        <w:t>컬럼</w:t>
-      </w:r>
-      <w:r>
-        <w:t xml:space="preserve">, Edit/Delete </w:t>
-      </w:r>
-      <w:r>
-        <w:t>버튼</w:t>
-      </w:r>
-      <w:r>
-        <w:t xml:space="preserve">, </w:t>
-      </w:r>
-      <w:r>
-        <w:t>하단</w:t>
-      </w:r>
-      <w:r>
-        <w:t xml:space="preserve"> </w:t>
-      </w:r>
-      <w:r>
-        <w:t>네비게이션</w:t>
-      </w:r>
-      <w:r>
-        <w:t>)</w:t>
-      </w:r>
-      <w:r>
-        <w:t>는</w:t>
-      </w:r>
-      <w:r>
-        <w:t xml:space="preserve"> index.html</w:t>
-      </w:r>
-      <w:r>
-        <w:t>을</w:t>
-      </w:r>
-      <w:r>
-        <w:t xml:space="preserve"> </w:t>
-      </w:r>
-      <w:r>
-        <w:t>그대로</w:t>
-      </w:r>
-      <w:r>
-        <w:t xml:space="preserve"> </w:t>
-      </w:r>
-      <w:r>
-        <w:t>복사한</w:t>
-      </w:r>
-      <w:r>
-        <w:t xml:space="preserve"> </w:t>
-      </w:r>
-      <w:r>
-        <w:t>것이라</w:t>
-      </w:r>
-      <w:r>
-        <w:t xml:space="preserve"> </w:t>
-      </w:r>
-      <w:r>
-        <w:t>안전</w:t>
-      </w:r>
-      <w:r>
-        <w:t xml:space="preserve"> </w:t>
-      </w:r>
-      <w:r>
-        <w:t>측과</w:t>
-      </w:r>
-      <w:r>
-        <w:t xml:space="preserve"> </w:t>
-      </w:r>
-      <w:r>
-        <w:t>동일하다</w:t>
-      </w:r>
-      <w:r>
-        <w:t>.</w:t>
+        <w:t xml:space="preserve">나머지(Email 컬럼, Edit/Delete 버튼, 하단 네비게이션)는 index.html을 그대로 복사한 것이라 안전 측과 동일하다.</w:t>
       </w:r>
     </w:p>
     <w:p>
@@ -3353,103 +1685,199 @@
           <w:sz w:val="18"/>
           <w:szCs w:val="18"/>
         </w:rPr>
-        <w:t xml:space="preserve"># 1) </w:t>
-      </w:r>
+        <w:t xml:space="preserve"># 1) 세션 로그인 (CSRF 활성 → GET /login 에서 토큰 추출)</w:t>
+      </w:r>
+    </w:p>
+    <w:p>
+      <w:pPr>
+        <w:pBdr>
+          <w:left w:val="single" w:sz="18" w:space="6" w:color="C0C0C0"/>
+        </w:pBdr>
+        <w:shd w:val="clear" w:color="auto" w:fill="F4F4F4"/>
+      </w:pPr>
       <w:r>
         <w:rPr>
           <w:rFonts w:ascii="Consolas" w:hAnsi="Consolas"/>
           <w:sz w:val="18"/>
           <w:szCs w:val="18"/>
         </w:rPr>
-        <w:t>세션</w:t>
-      </w:r>
+        <w:t>CSRF=$(curl -s -c $JAR "$B/login" | grep -o 'name="_csrf" value="[^"]*"' | sed 's/.*value="\(.*\)"/\1/')</w:t>
+      </w:r>
+    </w:p>
+    <w:p>
+      <w:pPr>
+        <w:pBdr>
+          <w:left w:val="single" w:sz="18" w:space="6" w:color="C0C0C0"/>
+        </w:pBdr>
+        <w:shd w:val="clear" w:color="auto" w:fill="F4F4F4"/>
+      </w:pPr>
       <w:r>
         <w:rPr>
           <w:rFonts w:ascii="Consolas" w:hAnsi="Consolas"/>
           <w:sz w:val="18"/>
           <w:szCs w:val="18"/>
         </w:rPr>
-        <w:t xml:space="preserve"> </w:t>
-      </w:r>
+        <w:t>curl -s -b $JAR -c $JAR -X POST "$B/login-process" \</w:t>
+      </w:r>
+    </w:p>
+    <w:p>
+      <w:pPr>
+        <w:pBdr>
+          <w:left w:val="single" w:sz="18" w:space="6" w:color="C0C0C0"/>
+        </w:pBdr>
+        <w:shd w:val="clear" w:color="auto" w:fill="F4F4F4"/>
+      </w:pPr>
       <w:r>
         <w:rPr>
           <w:rFonts w:ascii="Consolas" w:hAnsi="Consolas"/>
           <w:sz w:val="18"/>
           <w:szCs w:val="18"/>
         </w:rPr>
-        <w:t>로그인</w:t>
-      </w:r>
+        <w:t xml:space="preserve">  --data-urlencode "username=admin@aa.com" --data-urlencode "password=pwd1" \</w:t>
+      </w:r>
+    </w:p>
+    <w:p>
+      <w:pPr>
+        <w:pBdr>
+          <w:left w:val="single" w:sz="18" w:space="6" w:color="C0C0C0"/>
+        </w:pBdr>
+        <w:shd w:val="clear" w:color="auto" w:fill="F4F4F4"/>
+      </w:pPr>
       <w:r>
         <w:rPr>
           <w:rFonts w:ascii="Consolas" w:hAnsi="Consolas"/>
           <w:sz w:val="18"/>
           <w:szCs w:val="18"/>
         </w:rPr>
-        <w:t xml:space="preserve"> (CSRF </w:t>
-      </w:r>
+        <w:t xml:space="preserve">  --data-urlencode "_csrf=$CSRF"</w:t>
+      </w:r>
+    </w:p>
+    <w:p>
+      <w:pPr>
+        <w:pBdr>
+          <w:left w:val="single" w:sz="18" w:space="6" w:color="C0C0C0"/>
+        </w:pBdr>
+        <w:shd w:val="clear" w:color="auto" w:fill="F4F4F4"/>
+      </w:pPr>
       <w:r>
         <w:rPr>
           <w:rFonts w:ascii="Consolas" w:hAnsi="Consolas"/>
           <w:sz w:val="18"/>
           <w:szCs w:val="18"/>
         </w:rPr>
-        <w:t>활성</w:t>
-      </w:r>
+        <w:t xml:space="preserve"> </w:t>
+      </w:r>
+    </w:p>
+    <w:p>
+      <w:pPr>
+        <w:pBdr>
+          <w:left w:val="single" w:sz="18" w:space="6" w:color="C0C0C0"/>
+        </w:pBdr>
+        <w:shd w:val="clear" w:color="auto" w:fill="F4F4F4"/>
+      </w:pPr>
       <w:r>
         <w:rPr>
           <w:rFonts w:ascii="Consolas" w:hAnsi="Consolas"/>
           <w:sz w:val="18"/>
           <w:szCs w:val="18"/>
         </w:rPr>
-        <w:t xml:space="preserve"> → GET /login </w:t>
-      </w:r>
+        <w:t xml:space="preserve"># 2) 악성 이름으로 회원 추가</w:t>
+      </w:r>
+    </w:p>
+    <w:p>
+      <w:pPr>
+        <w:pBdr>
+          <w:left w:val="single" w:sz="18" w:space="6" w:color="C0C0C0"/>
+        </w:pBdr>
+        <w:shd w:val="clear" w:color="auto" w:fill="F4F4F4"/>
+      </w:pPr>
       <w:r>
         <w:rPr>
           <w:rFonts w:ascii="Consolas" w:hAnsi="Consolas"/>
           <w:sz w:val="18"/>
           <w:szCs w:val="18"/>
         </w:rPr>
-        <w:t>에서</w:t>
-      </w:r>
+        <w:t>CSRF2=$(curl -s -b $JAR "$B/users/signup" | grep -o 'name="_csrf" value="[^"]*"' | sed 's/.*value="\(.*\)"/\1/')</w:t>
+      </w:r>
+    </w:p>
+    <w:p>
+      <w:pPr>
+        <w:pBdr>
+          <w:left w:val="single" w:sz="18" w:space="6" w:color="C0C0C0"/>
+        </w:pBdr>
+        <w:shd w:val="clear" w:color="auto" w:fill="F4F4F4"/>
+      </w:pPr>
       <w:r>
         <w:rPr>
           <w:rFonts w:ascii="Consolas" w:hAnsi="Consolas"/>
           <w:sz w:val="18"/>
           <w:szCs w:val="18"/>
         </w:rPr>
-        <w:t xml:space="preserve"> </w:t>
-      </w:r>
+        <w:t>curl -s -b $JAR -c $JAR -X POST "$B/users/adduser" \</w:t>
+      </w:r>
+    </w:p>
+    <w:p>
+      <w:pPr>
+        <w:pBdr>
+          <w:left w:val="single" w:sz="18" w:space="6" w:color="C0C0C0"/>
+        </w:pBdr>
+        <w:shd w:val="clear" w:color="auto" w:fill="F4F4F4"/>
+      </w:pPr>
       <w:r>
         <w:rPr>
           <w:rFonts w:ascii="Consolas" w:hAnsi="Consolas"/>
           <w:sz w:val="18"/>
           <w:szCs w:val="18"/>
         </w:rPr>
-        <w:t>토큰</w:t>
-      </w:r>
+        <w:t xml:space="preserve">  --data-urlencode "name=&lt;script&gt;alert(document.domain)&lt;/script&gt;" \</w:t>
+      </w:r>
+    </w:p>
+    <w:p>
+      <w:pPr>
+        <w:pBdr>
+          <w:left w:val="single" w:sz="18" w:space="6" w:color="C0C0C0"/>
+        </w:pBdr>
+        <w:shd w:val="clear" w:color="auto" w:fill="F4F4F4"/>
+      </w:pPr>
       <w:r>
         <w:rPr>
           <w:rFonts w:ascii="Consolas" w:hAnsi="Consolas"/>
           <w:sz w:val="18"/>
           <w:szCs w:val="18"/>
         </w:rPr>
-        <w:t xml:space="preserve"> </w:t>
-      </w:r>
+        <w:t xml:space="preserve">  --data-urlencode "email=xss-demo@aa.com" \</w:t>
+      </w:r>
+    </w:p>
+    <w:p>
+      <w:pPr>
+        <w:pBdr>
+          <w:left w:val="single" w:sz="18" w:space="6" w:color="C0C0C0"/>
+        </w:pBdr>
+        <w:shd w:val="clear" w:color="auto" w:fill="F4F4F4"/>
+      </w:pPr>
       <w:r>
         <w:rPr>
           <w:rFonts w:ascii="Consolas" w:hAnsi="Consolas"/>
           <w:sz w:val="18"/>
           <w:szCs w:val="18"/>
         </w:rPr>
-        <w:t>추출</w:t>
-      </w:r>
+        <w:t xml:space="preserve">  --data-urlencode "_csrf=$CSRF2"</w:t>
+      </w:r>
+    </w:p>
+    <w:p>
+      <w:pPr>
+        <w:pBdr>
+          <w:left w:val="single" w:sz="18" w:space="6" w:color="C0C0C0"/>
+        </w:pBdr>
+        <w:shd w:val="clear" w:color="auto" w:fill="F4F4F4"/>
+      </w:pPr>
       <w:r>
         <w:rPr>
           <w:rFonts w:ascii="Consolas" w:hAnsi="Consolas"/>
           <w:sz w:val="18"/>
           <w:szCs w:val="18"/>
         </w:rPr>
-        <w:t>)</w:t>
+        <w:t xml:space="preserve"> </w:t>
       </w:r>
     </w:p>
     <w:p>
@@ -3465,327 +1893,7 @@
           <w:sz w:val="18"/>
           <w:szCs w:val="18"/>
         </w:rPr>
-        <w:t>CSRF=$(curl -s -c $JAR "$B/login" | grep -o 'name="_csrf" value="[^"]*"' | sed 's/.*value="\(.*\)"/\1/')</w:t>
-      </w:r>
-    </w:p>
-    <w:p>
-      <w:pPr>
-        <w:pBdr>
-          <w:left w:val="single" w:sz="18" w:space="6" w:color="C0C0C0"/>
-        </w:pBdr>
-        <w:shd w:val="clear" w:color="auto" w:fill="F4F4F4"/>
-      </w:pPr>
-      <w:r>
-        <w:rPr>
-          <w:rFonts w:ascii="Consolas" w:hAnsi="Consolas"/>
-          <w:sz w:val="18"/>
-          <w:szCs w:val="18"/>
-        </w:rPr>
-        <w:t>curl -s -b $JAR -c $JAR -X POST "$B/login-process" \</w:t>
-      </w:r>
-    </w:p>
-    <w:p>
-      <w:pPr>
-        <w:pBdr>
-          <w:left w:val="single" w:sz="18" w:space="6" w:color="C0C0C0"/>
-        </w:pBdr>
-        <w:shd w:val="clear" w:color="auto" w:fill="F4F4F4"/>
-      </w:pPr>
-      <w:r>
-        <w:rPr>
-          <w:rFonts w:ascii="Consolas" w:hAnsi="Consolas"/>
-          <w:sz w:val="18"/>
-          <w:szCs w:val="18"/>
-        </w:rPr>
-        <w:t xml:space="preserve">  --data-urlencode "username=admin@aa.com" --data-urlencode "password=pwd1" \</w:t>
-      </w:r>
-    </w:p>
-    <w:p>
-      <w:pPr>
-        <w:pBdr>
-          <w:left w:val="single" w:sz="18" w:space="6" w:color="C0C0C0"/>
-        </w:pBdr>
-        <w:shd w:val="clear" w:color="auto" w:fill="F4F4F4"/>
-      </w:pPr>
-      <w:r>
-        <w:rPr>
-          <w:rFonts w:ascii="Consolas" w:hAnsi="Consolas"/>
-          <w:sz w:val="18"/>
-          <w:szCs w:val="18"/>
-        </w:rPr>
-        <w:t xml:space="preserve">  --data-urlencode "_csrf=$CSRF"</w:t>
-      </w:r>
-    </w:p>
-    <w:p>
-      <w:pPr>
-        <w:pBdr>
-          <w:left w:val="single" w:sz="18" w:space="6" w:color="C0C0C0"/>
-        </w:pBdr>
-        <w:shd w:val="clear" w:color="auto" w:fill="F4F4F4"/>
-      </w:pPr>
-      <w:r>
-        <w:rPr>
-          <w:rFonts w:ascii="Consolas" w:hAnsi="Consolas"/>
-          <w:sz w:val="18"/>
-          <w:szCs w:val="18"/>
-        </w:rPr>
-        <w:t xml:space="preserve"> </w:t>
-      </w:r>
-    </w:p>
-    <w:p>
-      <w:pPr>
-        <w:pBdr>
-          <w:left w:val="single" w:sz="18" w:space="6" w:color="C0C0C0"/>
-        </w:pBdr>
-        <w:shd w:val="clear" w:color="auto" w:fill="F4F4F4"/>
-      </w:pPr>
-      <w:r>
-        <w:rPr>
-          <w:rFonts w:ascii="Consolas" w:hAnsi="Consolas"/>
-          <w:sz w:val="18"/>
-          <w:szCs w:val="18"/>
-        </w:rPr>
-        <w:t xml:space="preserve"># 2) </w:t>
-      </w:r>
-      <w:r>
-        <w:rPr>
-          <w:rFonts w:ascii="Consolas" w:hAnsi="Consolas"/>
-          <w:sz w:val="18"/>
-          <w:szCs w:val="18"/>
-        </w:rPr>
-        <w:t>악성</w:t>
-      </w:r>
-      <w:r>
-        <w:rPr>
-          <w:rFonts w:ascii="Consolas" w:hAnsi="Consolas"/>
-          <w:sz w:val="18"/>
-          <w:szCs w:val="18"/>
-        </w:rPr>
-        <w:t xml:space="preserve"> </w:t>
-      </w:r>
-      <w:r>
-        <w:rPr>
-          <w:rFonts w:ascii="Consolas" w:hAnsi="Consolas"/>
-          <w:sz w:val="18"/>
-          <w:szCs w:val="18"/>
-        </w:rPr>
-        <w:t>이름으로</w:t>
-      </w:r>
-      <w:r>
-        <w:rPr>
-          <w:rFonts w:ascii="Consolas" w:hAnsi="Consolas"/>
-          <w:sz w:val="18"/>
-          <w:szCs w:val="18"/>
-        </w:rPr>
-        <w:t xml:space="preserve"> </w:t>
-      </w:r>
-      <w:r>
-        <w:rPr>
-          <w:rFonts w:ascii="Consolas" w:hAnsi="Consolas"/>
-          <w:sz w:val="18"/>
-          <w:szCs w:val="18"/>
-        </w:rPr>
-        <w:t>회원</w:t>
-      </w:r>
-      <w:r>
-        <w:rPr>
-          <w:rFonts w:ascii="Consolas" w:hAnsi="Consolas"/>
-          <w:sz w:val="18"/>
-          <w:szCs w:val="18"/>
-        </w:rPr>
-        <w:t xml:space="preserve"> </w:t>
-      </w:r>
-      <w:r>
-        <w:rPr>
-          <w:rFonts w:ascii="Consolas" w:hAnsi="Consolas"/>
-          <w:sz w:val="18"/>
-          <w:szCs w:val="18"/>
-        </w:rPr>
-        <w:t>추가</w:t>
-      </w:r>
-    </w:p>
-    <w:p>
-      <w:pPr>
-        <w:pBdr>
-          <w:left w:val="single" w:sz="18" w:space="6" w:color="C0C0C0"/>
-        </w:pBdr>
-        <w:shd w:val="clear" w:color="auto" w:fill="F4F4F4"/>
-      </w:pPr>
-      <w:r>
-        <w:rPr>
-          <w:rFonts w:ascii="Consolas" w:hAnsi="Consolas"/>
-          <w:sz w:val="18"/>
-          <w:szCs w:val="18"/>
-        </w:rPr>
-        <w:t>CSRF2=$(curl -s -b $JAR "$B/users/signup" | grep -o 'name="_csrf" value="[^"]*"' | sed 's/.*value="\(.*\)"/\1/')</w:t>
-      </w:r>
-    </w:p>
-    <w:p>
-      <w:pPr>
-        <w:pBdr>
-          <w:left w:val="single" w:sz="18" w:space="6" w:color="C0C0C0"/>
-        </w:pBdr>
-        <w:shd w:val="clear" w:color="auto" w:fill="F4F4F4"/>
-      </w:pPr>
-      <w:r>
-        <w:rPr>
-          <w:rFonts w:ascii="Consolas" w:hAnsi="Consolas"/>
-          <w:sz w:val="18"/>
-          <w:szCs w:val="18"/>
-        </w:rPr>
-        <w:t>curl -s -b $JAR -c $JAR -X POST "$B/users/adduser" \</w:t>
-      </w:r>
-    </w:p>
-    <w:p>
-      <w:pPr>
-        <w:pBdr>
-          <w:left w:val="single" w:sz="18" w:space="6" w:color="C0C0C0"/>
-        </w:pBdr>
-        <w:shd w:val="clear" w:color="auto" w:fill="F4F4F4"/>
-      </w:pPr>
-      <w:r>
-        <w:rPr>
-          <w:rFonts w:ascii="Consolas" w:hAnsi="Consolas"/>
-          <w:sz w:val="18"/>
-          <w:szCs w:val="18"/>
-        </w:rPr>
-        <w:t xml:space="preserve">  --data-urlencode "name=&lt;script&gt;alert(document.domain)&lt;/script&gt;" \</w:t>
-      </w:r>
-    </w:p>
-    <w:p>
-      <w:pPr>
-        <w:pBdr>
-          <w:left w:val="single" w:sz="18" w:space="6" w:color="C0C0C0"/>
-        </w:pBdr>
-        <w:shd w:val="clear" w:color="auto" w:fill="F4F4F4"/>
-      </w:pPr>
-      <w:r>
-        <w:rPr>
-          <w:rFonts w:ascii="Consolas" w:hAnsi="Consolas"/>
-          <w:sz w:val="18"/>
-          <w:szCs w:val="18"/>
-        </w:rPr>
-        <w:t xml:space="preserve">  --data-urlencode "email=xss-demo@aa.com" \</w:t>
-      </w:r>
-    </w:p>
-    <w:p>
-      <w:pPr>
-        <w:pBdr>
-          <w:left w:val="single" w:sz="18" w:space="6" w:color="C0C0C0"/>
-        </w:pBdr>
-        <w:shd w:val="clear" w:color="auto" w:fill="F4F4F4"/>
-      </w:pPr>
-      <w:r>
-        <w:rPr>
-          <w:rFonts w:ascii="Consolas" w:hAnsi="Consolas"/>
-          <w:sz w:val="18"/>
-          <w:szCs w:val="18"/>
-        </w:rPr>
-        <w:t xml:space="preserve">  --data-urlencode "_csrf=$CSRF2"</w:t>
-      </w:r>
-    </w:p>
-    <w:p>
-      <w:pPr>
-        <w:pBdr>
-          <w:left w:val="single" w:sz="18" w:space="6" w:color="C0C0C0"/>
-        </w:pBdr>
-        <w:shd w:val="clear" w:color="auto" w:fill="F4F4F4"/>
-      </w:pPr>
-      <w:r>
-        <w:rPr>
-          <w:rFonts w:ascii="Consolas" w:hAnsi="Consolas"/>
-          <w:sz w:val="18"/>
-          <w:szCs w:val="18"/>
-        </w:rPr>
-        <w:t xml:space="preserve"> </w:t>
-      </w:r>
-    </w:p>
-    <w:p>
-      <w:pPr>
-        <w:pBdr>
-          <w:left w:val="single" w:sz="18" w:space="6" w:color="C0C0C0"/>
-        </w:pBdr>
-        <w:shd w:val="clear" w:color="auto" w:fill="F4F4F4"/>
-      </w:pPr>
-      <w:r>
-        <w:rPr>
-          <w:rFonts w:ascii="Consolas" w:hAnsi="Consolas"/>
-          <w:sz w:val="18"/>
-          <w:szCs w:val="18"/>
-        </w:rPr>
-        <w:t xml:space="preserve"># 3) </w:t>
-      </w:r>
-      <w:r>
-        <w:rPr>
-          <w:rFonts w:ascii="Consolas" w:hAnsi="Consolas"/>
-          <w:sz w:val="18"/>
-          <w:szCs w:val="18"/>
-        </w:rPr>
-        <w:t>두</w:t>
-      </w:r>
-      <w:r>
-        <w:rPr>
-          <w:rFonts w:ascii="Consolas" w:hAnsi="Consolas"/>
-          <w:sz w:val="18"/>
-          <w:szCs w:val="18"/>
-        </w:rPr>
-        <w:t xml:space="preserve"> </w:t>
-      </w:r>
-      <w:r>
-        <w:rPr>
-          <w:rFonts w:ascii="Consolas" w:hAnsi="Consolas"/>
-          <w:sz w:val="18"/>
-          <w:szCs w:val="18"/>
-        </w:rPr>
-        <w:t>목록</w:t>
-      </w:r>
-      <w:r>
-        <w:rPr>
-          <w:rFonts w:ascii="Consolas" w:hAnsi="Consolas"/>
-          <w:sz w:val="18"/>
-          <w:szCs w:val="18"/>
-        </w:rPr>
-        <w:t xml:space="preserve"> </w:t>
-      </w:r>
-      <w:r>
-        <w:rPr>
-          <w:rFonts w:ascii="Consolas" w:hAnsi="Consolas"/>
-          <w:sz w:val="18"/>
-          <w:szCs w:val="18"/>
-        </w:rPr>
-        <w:t>페이지가</w:t>
-      </w:r>
-      <w:r>
-        <w:rPr>
-          <w:rFonts w:ascii="Consolas" w:hAnsi="Consolas"/>
-          <w:sz w:val="18"/>
-          <w:szCs w:val="18"/>
-        </w:rPr>
-        <w:t xml:space="preserve"> </w:t>
-      </w:r>
-      <w:r>
-        <w:rPr>
-          <w:rFonts w:ascii="Consolas" w:hAnsi="Consolas"/>
-          <w:sz w:val="18"/>
-          <w:szCs w:val="18"/>
-        </w:rPr>
-        <w:t>내려주는</w:t>
-      </w:r>
-      <w:r>
-        <w:rPr>
-          <w:rFonts w:ascii="Consolas" w:hAnsi="Consolas"/>
-          <w:sz w:val="18"/>
-          <w:szCs w:val="18"/>
-        </w:rPr>
-        <w:t xml:space="preserve"> raw HTML </w:t>
-      </w:r>
-      <w:r>
-        <w:rPr>
-          <w:rFonts w:ascii="Consolas" w:hAnsi="Consolas"/>
-          <w:sz w:val="18"/>
-          <w:szCs w:val="18"/>
-        </w:rPr>
-        <w:t>비교</w:t>
+        <w:t xml:space="preserve"># 3) 두 목록 페이지가 내려주는 raw HTML 비교</w:t>
       </w:r>
     </w:p>
     <w:p>
@@ -4019,1572 +2127,332 @@
                 <w:sz w:val="16"/>
                 <w:szCs w:val="16"/>
               </w:rPr>
-              <w:t>서버</w:t>
-            </w:r>
+              <w:t xml:space="preserve">서버 주소와, curl 이 쿠키를 저장/재사용할 쿠키 저장 파일 이름을 변수로 지정</w:t>
+            </w:r>
+          </w:p>
+        </w:tc>
+      </w:tr>
+      <w:tr>
+        <w:tc>
+          <w:tcPr>
+            <w:tcW w:w="700" w:type="dxa"/>
+            <w:tcMar>
+              <w:top w:w="40" w:type="dxa"/>
+              <w:left w:w="80" w:type="dxa"/>
+              <w:bottom w:w="40" w:type="dxa"/>
+              <w:right w:w="80" w:type="dxa"/>
+            </w:tcMar>
+          </w:tcPr>
+          <w:p>
             <w:r>
               <w:rPr>
                 <w:rFonts w:ascii="Consolas" w:hAnsi="Consolas"/>
                 <w:sz w:val="16"/>
                 <w:szCs w:val="16"/>
               </w:rPr>
-              <w:t xml:space="preserve"> </w:t>
-            </w:r>
+              <w:t>1-1</w:t>
+            </w:r>
+          </w:p>
+        </w:tc>
+        <w:tc>
+          <w:tcPr>
+            <w:tcW w:w="3600" w:type="dxa"/>
+            <w:tcMar>
+              <w:top w:w="40" w:type="dxa"/>
+              <w:left w:w="80" w:type="dxa"/>
+              <w:bottom w:w="40" w:type="dxa"/>
+              <w:right w:w="80" w:type="dxa"/>
+            </w:tcMar>
+          </w:tcPr>
+          <w:p>
             <w:r>
               <w:rPr>
                 <w:rFonts w:ascii="Consolas" w:hAnsi="Consolas"/>
                 <w:sz w:val="16"/>
                 <w:szCs w:val="16"/>
               </w:rPr>
-              <w:t>주소와</w:t>
-            </w:r>
+              <w:t>CSRF=$(curl .../login | grep | sed)</w:t>
+            </w:r>
+          </w:p>
+        </w:tc>
+        <w:tc>
+          <w:tcPr>
+            <w:tcW w:w="4700" w:type="dxa"/>
+            <w:tcMar>
+              <w:top w:w="40" w:type="dxa"/>
+              <w:left w:w="80" w:type="dxa"/>
+              <w:bottom w:w="40" w:type="dxa"/>
+              <w:right w:w="80" w:type="dxa"/>
+            </w:tcMar>
+          </w:tcPr>
+          <w:p>
             <w:r>
               <w:rPr>
                 <w:rFonts w:ascii="Consolas" w:hAnsi="Consolas"/>
                 <w:sz w:val="16"/>
                 <w:szCs w:val="16"/>
               </w:rPr>
-              <w:t xml:space="preserve">, curl </w:t>
-            </w:r>
+              <w:t xml:space="preserve">로그인 폼 페이지에서 Thymeleaf가 자동 삽입한 hidden _csrf 토큰 값만 추출. 폼 로그인 체인은 CSRF가 켜져 있어 로그인 POST에도 필요</w:t>
+            </w:r>
+          </w:p>
+        </w:tc>
+      </w:tr>
+      <w:tr>
+        <w:tc>
+          <w:tcPr>
+            <w:tcW w:w="700" w:type="dxa"/>
+            <w:tcMar>
+              <w:top w:w="40" w:type="dxa"/>
+              <w:left w:w="80" w:type="dxa"/>
+              <w:bottom w:w="40" w:type="dxa"/>
+              <w:right w:w="80" w:type="dxa"/>
+            </w:tcMar>
+          </w:tcPr>
+          <w:p>
             <w:r>
               <w:rPr>
                 <w:rFonts w:ascii="Consolas" w:hAnsi="Consolas"/>
                 <w:sz w:val="16"/>
                 <w:szCs w:val="16"/>
               </w:rPr>
-              <w:t>이</w:t>
-            </w:r>
+              <w:t>1-2</w:t>
+            </w:r>
+          </w:p>
+        </w:tc>
+        <w:tc>
+          <w:tcPr>
+            <w:tcW w:w="3600" w:type="dxa"/>
+            <w:tcMar>
+              <w:top w:w="40" w:type="dxa"/>
+              <w:left w:w="80" w:type="dxa"/>
+              <w:bottom w:w="40" w:type="dxa"/>
+              <w:right w:w="80" w:type="dxa"/>
+            </w:tcMar>
+          </w:tcPr>
+          <w:p>
             <w:r>
               <w:rPr>
                 <w:rFonts w:ascii="Consolas" w:hAnsi="Consolas"/>
                 <w:sz w:val="16"/>
                 <w:szCs w:val="16"/>
               </w:rPr>
-              <w:t xml:space="preserve"> </w:t>
-            </w:r>
+              <w:t>curl ... -X POST /login-process</w:t>
+            </w:r>
+          </w:p>
+        </w:tc>
+        <w:tc>
+          <w:tcPr>
+            <w:tcW w:w="4700" w:type="dxa"/>
+            <w:tcMar>
+              <w:top w:w="40" w:type="dxa"/>
+              <w:left w:w="80" w:type="dxa"/>
+              <w:bottom w:w="40" w:type="dxa"/>
+              <w:right w:w="80" w:type="dxa"/>
+            </w:tcMar>
+          </w:tcPr>
+          <w:p>
             <w:r>
               <w:rPr>
                 <w:rFonts w:ascii="Consolas" w:hAnsi="Consolas"/>
                 <w:sz w:val="16"/>
                 <w:szCs w:val="16"/>
               </w:rPr>
-              <w:t>쿠키를</w:t>
-            </w:r>
+              <w:t xml:space="preserve">세션 로그인. 성공하면 JSESSIONID가 -c $JAR 로 파일에 저장되고, 이후 요청은 -b $JAR 로 그 쿠키를 재사용</w:t>
+            </w:r>
+          </w:p>
+        </w:tc>
+      </w:tr>
+      <w:tr>
+        <w:tc>
+          <w:tcPr>
+            <w:tcW w:w="700" w:type="dxa"/>
+            <w:tcMar>
+              <w:top w:w="40" w:type="dxa"/>
+              <w:left w:w="80" w:type="dxa"/>
+              <w:bottom w:w="40" w:type="dxa"/>
+              <w:right w:w="80" w:type="dxa"/>
+            </w:tcMar>
+          </w:tcPr>
+          <w:p>
             <w:r>
               <w:rPr>
                 <w:rFonts w:ascii="Consolas" w:hAnsi="Consolas"/>
                 <w:sz w:val="16"/>
                 <w:szCs w:val="16"/>
               </w:rPr>
-              <w:t xml:space="preserve"> </w:t>
-            </w:r>
+              <w:t>2-1</w:t>
+            </w:r>
+          </w:p>
+        </w:tc>
+        <w:tc>
+          <w:tcPr>
+            <w:tcW w:w="3600" w:type="dxa"/>
+            <w:tcMar>
+              <w:top w:w="40" w:type="dxa"/>
+              <w:left w:w="80" w:type="dxa"/>
+              <w:bottom w:w="40" w:type="dxa"/>
+              <w:right w:w="80" w:type="dxa"/>
+            </w:tcMar>
+          </w:tcPr>
+          <w:p>
             <w:r>
               <w:rPr>
                 <w:rFonts w:ascii="Consolas" w:hAnsi="Consolas"/>
                 <w:sz w:val="16"/>
                 <w:szCs w:val="16"/>
               </w:rPr>
-              <w:t>저장</w:t>
-            </w:r>
+              <w:t>CSRF2=$(curl .../signup | ...)</w:t>
+            </w:r>
+          </w:p>
+        </w:tc>
+        <w:tc>
+          <w:tcPr>
+            <w:tcW w:w="4700" w:type="dxa"/>
+            <w:tcMar>
+              <w:top w:w="40" w:type="dxa"/>
+              <w:left w:w="80" w:type="dxa"/>
+              <w:bottom w:w="40" w:type="dxa"/>
+              <w:right w:w="80" w:type="dxa"/>
+            </w:tcMar>
+          </w:tcPr>
+          <w:p>
             <w:r>
               <w:rPr>
                 <w:rFonts w:ascii="Consolas" w:hAnsi="Consolas"/>
                 <w:sz w:val="16"/>
                 <w:szCs w:val="16"/>
               </w:rPr>
-              <w:t>/</w:t>
-            </w:r>
+              <w:t xml:space="preserve">회원가입 폼 전용 _csrf 토큰을 다시 추출(세션은 1에서 로그인된 상태 유지)</w:t>
+            </w:r>
+          </w:p>
+        </w:tc>
+      </w:tr>
+      <w:tr>
+        <w:tc>
+          <w:tcPr>
+            <w:tcW w:w="700" w:type="dxa"/>
+            <w:tcMar>
+              <w:top w:w="40" w:type="dxa"/>
+              <w:left w:w="80" w:type="dxa"/>
+              <w:bottom w:w="40" w:type="dxa"/>
+              <w:right w:w="80" w:type="dxa"/>
+            </w:tcMar>
+          </w:tcPr>
+          <w:p>
             <w:r>
               <w:rPr>
                 <w:rFonts w:ascii="Consolas" w:hAnsi="Consolas"/>
                 <w:sz w:val="16"/>
                 <w:szCs w:val="16"/>
               </w:rPr>
-              <w:t>재사용할</w:t>
-            </w:r>
+              <w:t>2-2 (공격)</w:t>
+            </w:r>
+          </w:p>
+        </w:tc>
+        <w:tc>
+          <w:tcPr>
+            <w:tcW w:w="3600" w:type="dxa"/>
+            <w:tcMar>
+              <w:top w:w="40" w:type="dxa"/>
+              <w:left w:w="80" w:type="dxa"/>
+              <w:bottom w:w="40" w:type="dxa"/>
+              <w:right w:w="80" w:type="dxa"/>
+            </w:tcMar>
+          </w:tcPr>
+          <w:p>
             <w:r>
               <w:rPr>
                 <w:rFonts w:ascii="Consolas" w:hAnsi="Consolas"/>
                 <w:sz w:val="16"/>
                 <w:szCs w:val="16"/>
               </w:rPr>
-              <w:t xml:space="preserve"> </w:t>
-            </w:r>
+              <w:t>curl ... POST /users/adduser (name=&lt;script&gt;...)</w:t>
+            </w:r>
+          </w:p>
+        </w:tc>
+        <w:tc>
+          <w:tcPr>
+            <w:tcW w:w="4700" w:type="dxa"/>
+            <w:tcMar>
+              <w:top w:w="40" w:type="dxa"/>
+              <w:left w:w="80" w:type="dxa"/>
+              <w:bottom w:w="40" w:type="dxa"/>
+              <w:right w:w="80" w:type="dxa"/>
+            </w:tcMar>
+          </w:tcPr>
+          <w:p>
             <w:r>
               <w:rPr>
                 <w:rFonts w:ascii="Consolas" w:hAnsi="Consolas"/>
                 <w:sz w:val="16"/>
                 <w:szCs w:val="16"/>
               </w:rPr>
-              <w:t>쿠키</w:t>
-            </w:r>
+              <w:t xml:space="preserve">실제 공격. 이름 필드에 스크립트를 넣어 회원가입 → DB에 그대로 저장(Stored). 이 요청 한 번으로 공격이 완성된다</w:t>
+            </w:r>
+          </w:p>
+        </w:tc>
+      </w:tr>
+      <w:tr>
+        <w:tc>
+          <w:tcPr>
+            <w:tcW w:w="700" w:type="dxa"/>
+            <w:tcMar>
+              <w:top w:w="40" w:type="dxa"/>
+              <w:left w:w="80" w:type="dxa"/>
+              <w:bottom w:w="40" w:type="dxa"/>
+              <w:right w:w="80" w:type="dxa"/>
+            </w:tcMar>
+          </w:tcPr>
+          <w:p>
             <w:r>
               <w:rPr>
                 <w:rFonts w:ascii="Consolas" w:hAnsi="Consolas"/>
                 <w:sz w:val="16"/>
                 <w:szCs w:val="16"/>
               </w:rPr>
-              <w:t xml:space="preserve"> </w:t>
-            </w:r>
+              <w:t>3</w:t>
+            </w:r>
+          </w:p>
+        </w:tc>
+        <w:tc>
+          <w:tcPr>
+            <w:tcW w:w="3600" w:type="dxa"/>
+            <w:tcMar>
+              <w:top w:w="40" w:type="dxa"/>
+              <w:left w:w="80" w:type="dxa"/>
+              <w:bottom w:w="40" w:type="dxa"/>
+              <w:right w:w="80" w:type="dxa"/>
+            </w:tcMar>
+          </w:tcPr>
+          <w:p>
             <w:r>
               <w:rPr>
                 <w:rFonts w:ascii="Consolas" w:hAnsi="Consolas"/>
                 <w:sz w:val="16"/>
                 <w:szCs w:val="16"/>
               </w:rPr>
-              <w:t>저장</w:t>
-            </w:r>
+              <w:t>curl .../index , .../index-vuln</w:t>
+            </w:r>
+          </w:p>
+        </w:tc>
+        <w:tc>
+          <w:tcPr>
+            <w:tcW w:w="4700" w:type="dxa"/>
+            <w:tcMar>
+              <w:top w:w="40" w:type="dxa"/>
+              <w:left w:w="80" w:type="dxa"/>
+              <w:bottom w:w="40" w:type="dxa"/>
+              <w:right w:w="80" w:type="dxa"/>
+            </w:tcMar>
+          </w:tcPr>
+          <w:p>
             <w:r>
               <w:rPr>
                 <w:rFonts w:ascii="Consolas" w:hAnsi="Consolas"/>
                 <w:sz w:val="16"/>
                 <w:szCs w:val="16"/>
               </w:rPr>
-              <w:t xml:space="preserve"> </w:t>
-            </w:r>
-            <w:r>
-              <w:rPr>
-                <w:rFonts w:ascii="Consolas" w:hAnsi="Consolas"/>
-                <w:sz w:val="16"/>
-                <w:szCs w:val="16"/>
-              </w:rPr>
-              <w:t>파일</w:t>
-            </w:r>
-            <w:r>
-              <w:rPr>
-                <w:rFonts w:ascii="Consolas" w:hAnsi="Consolas"/>
-                <w:sz w:val="16"/>
-                <w:szCs w:val="16"/>
-              </w:rPr>
-              <w:t xml:space="preserve"> </w:t>
-            </w:r>
-            <w:r>
-              <w:rPr>
-                <w:rFonts w:ascii="Consolas" w:hAnsi="Consolas"/>
-                <w:sz w:val="16"/>
-                <w:szCs w:val="16"/>
-              </w:rPr>
-              <w:t>이름을</w:t>
-            </w:r>
-            <w:r>
-              <w:rPr>
-                <w:rFonts w:ascii="Consolas" w:hAnsi="Consolas"/>
-                <w:sz w:val="16"/>
-                <w:szCs w:val="16"/>
-              </w:rPr>
-              <w:t xml:space="preserve"> </w:t>
-            </w:r>
-            <w:r>
-              <w:rPr>
-                <w:rFonts w:ascii="Consolas" w:hAnsi="Consolas"/>
-                <w:sz w:val="16"/>
-                <w:szCs w:val="16"/>
-              </w:rPr>
-              <w:t>변수로</w:t>
-            </w:r>
-            <w:r>
-              <w:rPr>
-                <w:rFonts w:ascii="Consolas" w:hAnsi="Consolas"/>
-                <w:sz w:val="16"/>
-                <w:szCs w:val="16"/>
-              </w:rPr>
-              <w:t xml:space="preserve"> </w:t>
-            </w:r>
-            <w:r>
-              <w:rPr>
-                <w:rFonts w:ascii="Consolas" w:hAnsi="Consolas"/>
-                <w:sz w:val="16"/>
-                <w:szCs w:val="16"/>
-              </w:rPr>
-              <w:t>지정</w:t>
-            </w:r>
-          </w:p>
-        </w:tc>
-      </w:tr>
-      <w:tr>
-        <w:tc>
-          <w:tcPr>
-            <w:tcW w:w="700" w:type="dxa"/>
-            <w:tcMar>
-              <w:top w:w="40" w:type="dxa"/>
-              <w:left w:w="80" w:type="dxa"/>
-              <w:bottom w:w="40" w:type="dxa"/>
-              <w:right w:w="80" w:type="dxa"/>
-            </w:tcMar>
-          </w:tcPr>
-          <w:p>
-            <w:r>
-              <w:rPr>
-                <w:rFonts w:ascii="Consolas" w:hAnsi="Consolas"/>
-                <w:sz w:val="16"/>
-                <w:szCs w:val="16"/>
-              </w:rPr>
-              <w:t>1-1</w:t>
-            </w:r>
-          </w:p>
-        </w:tc>
-        <w:tc>
-          <w:tcPr>
-            <w:tcW w:w="3600" w:type="dxa"/>
-            <w:tcMar>
-              <w:top w:w="40" w:type="dxa"/>
-              <w:left w:w="80" w:type="dxa"/>
-              <w:bottom w:w="40" w:type="dxa"/>
-              <w:right w:w="80" w:type="dxa"/>
-            </w:tcMar>
-          </w:tcPr>
-          <w:p>
-            <w:r>
-              <w:rPr>
-                <w:rFonts w:ascii="Consolas" w:hAnsi="Consolas"/>
-                <w:sz w:val="16"/>
-                <w:szCs w:val="16"/>
-              </w:rPr>
-              <w:t>CSRF=$(curl .../login | grep | sed)</w:t>
-            </w:r>
-          </w:p>
-        </w:tc>
-        <w:tc>
-          <w:tcPr>
-            <w:tcW w:w="4700" w:type="dxa"/>
-            <w:tcMar>
-              <w:top w:w="40" w:type="dxa"/>
-              <w:left w:w="80" w:type="dxa"/>
-              <w:bottom w:w="40" w:type="dxa"/>
-              <w:right w:w="80" w:type="dxa"/>
-            </w:tcMar>
-          </w:tcPr>
-          <w:p>
-            <w:r>
-              <w:rPr>
-                <w:rFonts w:ascii="Consolas" w:hAnsi="Consolas"/>
-                <w:sz w:val="16"/>
-                <w:szCs w:val="16"/>
-              </w:rPr>
-              <w:t>로그인</w:t>
-            </w:r>
-            <w:r>
-              <w:rPr>
-                <w:rFonts w:ascii="Consolas" w:hAnsi="Consolas"/>
-                <w:sz w:val="16"/>
-                <w:szCs w:val="16"/>
-              </w:rPr>
-              <w:t xml:space="preserve"> </w:t>
-            </w:r>
-            <w:r>
-              <w:rPr>
-                <w:rFonts w:ascii="Consolas" w:hAnsi="Consolas"/>
-                <w:sz w:val="16"/>
-                <w:szCs w:val="16"/>
-              </w:rPr>
-              <w:t>폼</w:t>
-            </w:r>
-            <w:r>
-              <w:rPr>
-                <w:rFonts w:ascii="Consolas" w:hAnsi="Consolas"/>
-                <w:sz w:val="16"/>
-                <w:szCs w:val="16"/>
-              </w:rPr>
-              <w:t xml:space="preserve"> </w:t>
-            </w:r>
-            <w:r>
-              <w:rPr>
-                <w:rFonts w:ascii="Consolas" w:hAnsi="Consolas"/>
-                <w:sz w:val="16"/>
-                <w:szCs w:val="16"/>
-              </w:rPr>
-              <w:t>페이지에서</w:t>
-            </w:r>
-            <w:r>
-              <w:rPr>
-                <w:rFonts w:ascii="Consolas" w:hAnsi="Consolas"/>
-                <w:sz w:val="16"/>
-                <w:szCs w:val="16"/>
-              </w:rPr>
-              <w:t xml:space="preserve"> Thymeleaf</w:t>
-            </w:r>
-            <w:r>
-              <w:rPr>
-                <w:rFonts w:ascii="Consolas" w:hAnsi="Consolas"/>
-                <w:sz w:val="16"/>
-                <w:szCs w:val="16"/>
-              </w:rPr>
-              <w:t>가</w:t>
-            </w:r>
-            <w:r>
-              <w:rPr>
-                <w:rFonts w:ascii="Consolas" w:hAnsi="Consolas"/>
-                <w:sz w:val="16"/>
-                <w:szCs w:val="16"/>
-              </w:rPr>
-              <w:t xml:space="preserve"> </w:t>
-            </w:r>
-            <w:r>
-              <w:rPr>
-                <w:rFonts w:ascii="Consolas" w:hAnsi="Consolas"/>
-                <w:sz w:val="16"/>
-                <w:szCs w:val="16"/>
-              </w:rPr>
-              <w:t>자동</w:t>
-            </w:r>
-            <w:r>
-              <w:rPr>
-                <w:rFonts w:ascii="Consolas" w:hAnsi="Consolas"/>
-                <w:sz w:val="16"/>
-                <w:szCs w:val="16"/>
-              </w:rPr>
-              <w:t xml:space="preserve"> </w:t>
-            </w:r>
-            <w:r>
-              <w:rPr>
-                <w:rFonts w:ascii="Consolas" w:hAnsi="Consolas"/>
-                <w:sz w:val="16"/>
-                <w:szCs w:val="16"/>
-              </w:rPr>
-              <w:t>삽입한</w:t>
-            </w:r>
-            <w:r>
-              <w:rPr>
-                <w:rFonts w:ascii="Consolas" w:hAnsi="Consolas"/>
-                <w:sz w:val="16"/>
-                <w:szCs w:val="16"/>
-              </w:rPr>
-              <w:t xml:space="preserve"> hidden _csrf </w:t>
-            </w:r>
-            <w:r>
-              <w:rPr>
-                <w:rFonts w:ascii="Consolas" w:hAnsi="Consolas"/>
-                <w:sz w:val="16"/>
-                <w:szCs w:val="16"/>
-              </w:rPr>
-              <w:t>토큰</w:t>
-            </w:r>
-            <w:r>
-              <w:rPr>
-                <w:rFonts w:ascii="Consolas" w:hAnsi="Consolas"/>
-                <w:sz w:val="16"/>
-                <w:szCs w:val="16"/>
-              </w:rPr>
-              <w:t xml:space="preserve"> </w:t>
-            </w:r>
-            <w:r>
-              <w:rPr>
-                <w:rFonts w:ascii="Consolas" w:hAnsi="Consolas"/>
-                <w:sz w:val="16"/>
-                <w:szCs w:val="16"/>
-              </w:rPr>
-              <w:t>값만</w:t>
-            </w:r>
-            <w:r>
-              <w:rPr>
-                <w:rFonts w:ascii="Consolas" w:hAnsi="Consolas"/>
-                <w:sz w:val="16"/>
-                <w:szCs w:val="16"/>
-              </w:rPr>
-              <w:t xml:space="preserve"> </w:t>
-            </w:r>
-            <w:r>
-              <w:rPr>
-                <w:rFonts w:ascii="Consolas" w:hAnsi="Consolas"/>
-                <w:sz w:val="16"/>
-                <w:szCs w:val="16"/>
-              </w:rPr>
-              <w:t>추출</w:t>
-            </w:r>
-            <w:r>
-              <w:rPr>
-                <w:rFonts w:ascii="Consolas" w:hAnsi="Consolas"/>
-                <w:sz w:val="16"/>
-                <w:szCs w:val="16"/>
-              </w:rPr>
-              <w:t xml:space="preserve">. </w:t>
-            </w:r>
-            <w:r>
-              <w:rPr>
-                <w:rFonts w:ascii="Consolas" w:hAnsi="Consolas"/>
-                <w:sz w:val="16"/>
-                <w:szCs w:val="16"/>
-              </w:rPr>
-              <w:t>폼</w:t>
-            </w:r>
-            <w:r>
-              <w:rPr>
-                <w:rFonts w:ascii="Consolas" w:hAnsi="Consolas"/>
-                <w:sz w:val="16"/>
-                <w:szCs w:val="16"/>
-              </w:rPr>
-              <w:t xml:space="preserve"> </w:t>
-            </w:r>
-            <w:r>
-              <w:rPr>
-                <w:rFonts w:ascii="Consolas" w:hAnsi="Consolas"/>
-                <w:sz w:val="16"/>
-                <w:szCs w:val="16"/>
-              </w:rPr>
-              <w:t>로그인</w:t>
-            </w:r>
-            <w:r>
-              <w:rPr>
-                <w:rFonts w:ascii="Consolas" w:hAnsi="Consolas"/>
-                <w:sz w:val="16"/>
-                <w:szCs w:val="16"/>
-              </w:rPr>
-              <w:t xml:space="preserve"> </w:t>
-            </w:r>
-            <w:r>
-              <w:rPr>
-                <w:rFonts w:ascii="Consolas" w:hAnsi="Consolas"/>
-                <w:sz w:val="16"/>
-                <w:szCs w:val="16"/>
-              </w:rPr>
-              <w:t>체인은</w:t>
-            </w:r>
-            <w:r>
-              <w:rPr>
-                <w:rFonts w:ascii="Consolas" w:hAnsi="Consolas"/>
-                <w:sz w:val="16"/>
-                <w:szCs w:val="16"/>
-              </w:rPr>
-              <w:t xml:space="preserve"> CSRF</w:t>
-            </w:r>
-            <w:r>
-              <w:rPr>
-                <w:rFonts w:ascii="Consolas" w:hAnsi="Consolas"/>
-                <w:sz w:val="16"/>
-                <w:szCs w:val="16"/>
-              </w:rPr>
-              <w:t>가</w:t>
-            </w:r>
-            <w:r>
-              <w:rPr>
-                <w:rFonts w:ascii="Consolas" w:hAnsi="Consolas"/>
-                <w:sz w:val="16"/>
-                <w:szCs w:val="16"/>
-              </w:rPr>
-              <w:t xml:space="preserve"> </w:t>
-            </w:r>
-            <w:r>
-              <w:rPr>
-                <w:rFonts w:ascii="Consolas" w:hAnsi="Consolas"/>
-                <w:sz w:val="16"/>
-                <w:szCs w:val="16"/>
-              </w:rPr>
-              <w:t>켜져</w:t>
-            </w:r>
-            <w:r>
-              <w:rPr>
-                <w:rFonts w:ascii="Consolas" w:hAnsi="Consolas"/>
-                <w:sz w:val="16"/>
-                <w:szCs w:val="16"/>
-              </w:rPr>
-              <w:t xml:space="preserve"> </w:t>
-            </w:r>
-            <w:r>
-              <w:rPr>
-                <w:rFonts w:ascii="Consolas" w:hAnsi="Consolas"/>
-                <w:sz w:val="16"/>
-                <w:szCs w:val="16"/>
-              </w:rPr>
-              <w:t>있어</w:t>
-            </w:r>
-            <w:r>
-              <w:rPr>
-                <w:rFonts w:ascii="Consolas" w:hAnsi="Consolas"/>
-                <w:sz w:val="16"/>
-                <w:szCs w:val="16"/>
-              </w:rPr>
-              <w:t xml:space="preserve"> </w:t>
-            </w:r>
-            <w:r>
-              <w:rPr>
-                <w:rFonts w:ascii="Consolas" w:hAnsi="Consolas"/>
-                <w:sz w:val="16"/>
-                <w:szCs w:val="16"/>
-              </w:rPr>
-              <w:t>로그인</w:t>
-            </w:r>
-            <w:r>
-              <w:rPr>
-                <w:rFonts w:ascii="Consolas" w:hAnsi="Consolas"/>
-                <w:sz w:val="16"/>
-                <w:szCs w:val="16"/>
-              </w:rPr>
-              <w:t xml:space="preserve"> POST</w:t>
-            </w:r>
-            <w:r>
-              <w:rPr>
-                <w:rFonts w:ascii="Consolas" w:hAnsi="Consolas"/>
-                <w:sz w:val="16"/>
-                <w:szCs w:val="16"/>
-              </w:rPr>
-              <w:t>에도</w:t>
-            </w:r>
-            <w:r>
-              <w:rPr>
-                <w:rFonts w:ascii="Consolas" w:hAnsi="Consolas"/>
-                <w:sz w:val="16"/>
-                <w:szCs w:val="16"/>
-              </w:rPr>
-              <w:t xml:space="preserve"> </w:t>
-            </w:r>
-            <w:r>
-              <w:rPr>
-                <w:rFonts w:ascii="Consolas" w:hAnsi="Consolas"/>
-                <w:sz w:val="16"/>
-                <w:szCs w:val="16"/>
-              </w:rPr>
-              <w:t>필요</w:t>
-            </w:r>
-          </w:p>
-        </w:tc>
-      </w:tr>
-      <w:tr>
-        <w:tc>
-          <w:tcPr>
-            <w:tcW w:w="700" w:type="dxa"/>
-            <w:tcMar>
-              <w:top w:w="40" w:type="dxa"/>
-              <w:left w:w="80" w:type="dxa"/>
-              <w:bottom w:w="40" w:type="dxa"/>
-              <w:right w:w="80" w:type="dxa"/>
-            </w:tcMar>
-          </w:tcPr>
-          <w:p>
-            <w:r>
-              <w:rPr>
-                <w:rFonts w:ascii="Consolas" w:hAnsi="Consolas"/>
-                <w:sz w:val="16"/>
-                <w:szCs w:val="16"/>
-              </w:rPr>
-              <w:t>1-2</w:t>
-            </w:r>
-          </w:p>
-        </w:tc>
-        <w:tc>
-          <w:tcPr>
-            <w:tcW w:w="3600" w:type="dxa"/>
-            <w:tcMar>
-              <w:top w:w="40" w:type="dxa"/>
-              <w:left w:w="80" w:type="dxa"/>
-              <w:bottom w:w="40" w:type="dxa"/>
-              <w:right w:w="80" w:type="dxa"/>
-            </w:tcMar>
-          </w:tcPr>
-          <w:p>
-            <w:r>
-              <w:rPr>
-                <w:rFonts w:ascii="Consolas" w:hAnsi="Consolas"/>
-                <w:sz w:val="16"/>
-                <w:szCs w:val="16"/>
-              </w:rPr>
-              <w:t>curl ... -X POST /login-process</w:t>
-            </w:r>
-          </w:p>
-        </w:tc>
-        <w:tc>
-          <w:tcPr>
-            <w:tcW w:w="4700" w:type="dxa"/>
-            <w:tcMar>
-              <w:top w:w="40" w:type="dxa"/>
-              <w:left w:w="80" w:type="dxa"/>
-              <w:bottom w:w="40" w:type="dxa"/>
-              <w:right w:w="80" w:type="dxa"/>
-            </w:tcMar>
-          </w:tcPr>
-          <w:p>
-            <w:r>
-              <w:rPr>
-                <w:rFonts w:ascii="Consolas" w:hAnsi="Consolas"/>
-                <w:sz w:val="16"/>
-                <w:szCs w:val="16"/>
-              </w:rPr>
-              <w:t>세션</w:t>
-            </w:r>
-            <w:r>
-              <w:rPr>
-                <w:rFonts w:ascii="Consolas" w:hAnsi="Consolas"/>
-                <w:sz w:val="16"/>
-                <w:szCs w:val="16"/>
-              </w:rPr>
-              <w:t xml:space="preserve"> </w:t>
-            </w:r>
-            <w:r>
-              <w:rPr>
-                <w:rFonts w:ascii="Consolas" w:hAnsi="Consolas"/>
-                <w:sz w:val="16"/>
-                <w:szCs w:val="16"/>
-              </w:rPr>
-              <w:t>로그인</w:t>
-            </w:r>
-            <w:r>
-              <w:rPr>
-                <w:rFonts w:ascii="Consolas" w:hAnsi="Consolas"/>
-                <w:sz w:val="16"/>
-                <w:szCs w:val="16"/>
-              </w:rPr>
-              <w:t xml:space="preserve">. </w:t>
-            </w:r>
-            <w:r>
-              <w:rPr>
-                <w:rFonts w:ascii="Consolas" w:hAnsi="Consolas"/>
-                <w:sz w:val="16"/>
-                <w:szCs w:val="16"/>
-              </w:rPr>
-              <w:t>성공하면</w:t>
-            </w:r>
-            <w:r>
-              <w:rPr>
-                <w:rFonts w:ascii="Consolas" w:hAnsi="Consolas"/>
-                <w:sz w:val="16"/>
-                <w:szCs w:val="16"/>
-              </w:rPr>
-              <w:t xml:space="preserve"> JSESSIONID</w:t>
-            </w:r>
-            <w:r>
-              <w:rPr>
-                <w:rFonts w:ascii="Consolas" w:hAnsi="Consolas"/>
-                <w:sz w:val="16"/>
-                <w:szCs w:val="16"/>
-              </w:rPr>
-              <w:t>가</w:t>
-            </w:r>
-            <w:r>
-              <w:rPr>
-                <w:rFonts w:ascii="Consolas" w:hAnsi="Consolas"/>
-                <w:sz w:val="16"/>
-                <w:szCs w:val="16"/>
-              </w:rPr>
-              <w:t xml:space="preserve"> -c $JAR </w:t>
-            </w:r>
-            <w:r>
-              <w:rPr>
-                <w:rFonts w:ascii="Consolas" w:hAnsi="Consolas"/>
-                <w:sz w:val="16"/>
-                <w:szCs w:val="16"/>
-              </w:rPr>
-              <w:t>로</w:t>
-            </w:r>
-            <w:r>
-              <w:rPr>
-                <w:rFonts w:ascii="Consolas" w:hAnsi="Consolas"/>
-                <w:sz w:val="16"/>
-                <w:szCs w:val="16"/>
-              </w:rPr>
-              <w:t xml:space="preserve"> </w:t>
-            </w:r>
-            <w:r>
-              <w:rPr>
-                <w:rFonts w:ascii="Consolas" w:hAnsi="Consolas"/>
-                <w:sz w:val="16"/>
-                <w:szCs w:val="16"/>
-              </w:rPr>
-              <w:t>파일에</w:t>
-            </w:r>
-            <w:r>
-              <w:rPr>
-                <w:rFonts w:ascii="Consolas" w:hAnsi="Consolas"/>
-                <w:sz w:val="16"/>
-                <w:szCs w:val="16"/>
-              </w:rPr>
-              <w:t xml:space="preserve"> </w:t>
-            </w:r>
-            <w:r>
-              <w:rPr>
-                <w:rFonts w:ascii="Consolas" w:hAnsi="Consolas"/>
-                <w:sz w:val="16"/>
-                <w:szCs w:val="16"/>
-              </w:rPr>
-              <w:t>저장되고</w:t>
-            </w:r>
-            <w:r>
-              <w:rPr>
-                <w:rFonts w:ascii="Consolas" w:hAnsi="Consolas"/>
-                <w:sz w:val="16"/>
-                <w:szCs w:val="16"/>
-              </w:rPr>
-              <w:t xml:space="preserve">, </w:t>
-            </w:r>
-            <w:r>
-              <w:rPr>
-                <w:rFonts w:ascii="Consolas" w:hAnsi="Consolas"/>
-                <w:sz w:val="16"/>
-                <w:szCs w:val="16"/>
-              </w:rPr>
-              <w:t>이후</w:t>
-            </w:r>
-            <w:r>
-              <w:rPr>
-                <w:rFonts w:ascii="Consolas" w:hAnsi="Consolas"/>
-                <w:sz w:val="16"/>
-                <w:szCs w:val="16"/>
-              </w:rPr>
-              <w:t xml:space="preserve"> </w:t>
-            </w:r>
-            <w:r>
-              <w:rPr>
-                <w:rFonts w:ascii="Consolas" w:hAnsi="Consolas"/>
-                <w:sz w:val="16"/>
-                <w:szCs w:val="16"/>
-              </w:rPr>
-              <w:t>요청은</w:t>
-            </w:r>
-            <w:r>
-              <w:rPr>
-                <w:rFonts w:ascii="Consolas" w:hAnsi="Consolas"/>
-                <w:sz w:val="16"/>
-                <w:szCs w:val="16"/>
-              </w:rPr>
-              <w:t xml:space="preserve"> -b $JAR </w:t>
-            </w:r>
-            <w:r>
-              <w:rPr>
-                <w:rFonts w:ascii="Consolas" w:hAnsi="Consolas"/>
-                <w:sz w:val="16"/>
-                <w:szCs w:val="16"/>
-              </w:rPr>
-              <w:t>로</w:t>
-            </w:r>
-            <w:r>
-              <w:rPr>
-                <w:rFonts w:ascii="Consolas" w:hAnsi="Consolas"/>
-                <w:sz w:val="16"/>
-                <w:szCs w:val="16"/>
-              </w:rPr>
-              <w:t xml:space="preserve"> </w:t>
-            </w:r>
-            <w:r>
-              <w:rPr>
-                <w:rFonts w:ascii="Consolas" w:hAnsi="Consolas"/>
-                <w:sz w:val="16"/>
-                <w:szCs w:val="16"/>
-              </w:rPr>
-              <w:t>그</w:t>
-            </w:r>
-            <w:r>
-              <w:rPr>
-                <w:rFonts w:ascii="Consolas" w:hAnsi="Consolas"/>
-                <w:sz w:val="16"/>
-                <w:szCs w:val="16"/>
-              </w:rPr>
-              <w:t xml:space="preserve"> </w:t>
-            </w:r>
-            <w:r>
-              <w:rPr>
-                <w:rFonts w:ascii="Consolas" w:hAnsi="Consolas"/>
-                <w:sz w:val="16"/>
-                <w:szCs w:val="16"/>
-              </w:rPr>
-              <w:t>쿠키를</w:t>
-            </w:r>
-            <w:r>
-              <w:rPr>
-                <w:rFonts w:ascii="Consolas" w:hAnsi="Consolas"/>
-                <w:sz w:val="16"/>
-                <w:szCs w:val="16"/>
-              </w:rPr>
-              <w:t xml:space="preserve"> </w:t>
-            </w:r>
-            <w:r>
-              <w:rPr>
-                <w:rFonts w:ascii="Consolas" w:hAnsi="Consolas"/>
-                <w:sz w:val="16"/>
-                <w:szCs w:val="16"/>
-              </w:rPr>
-              <w:t>재사용</w:t>
-            </w:r>
-          </w:p>
-        </w:tc>
-      </w:tr>
-      <w:tr>
-        <w:tc>
-          <w:tcPr>
-            <w:tcW w:w="700" w:type="dxa"/>
-            <w:tcMar>
-              <w:top w:w="40" w:type="dxa"/>
-              <w:left w:w="80" w:type="dxa"/>
-              <w:bottom w:w="40" w:type="dxa"/>
-              <w:right w:w="80" w:type="dxa"/>
-            </w:tcMar>
-          </w:tcPr>
-          <w:p>
-            <w:r>
-              <w:rPr>
-                <w:rFonts w:ascii="Consolas" w:hAnsi="Consolas"/>
-                <w:sz w:val="16"/>
-                <w:szCs w:val="16"/>
-              </w:rPr>
-              <w:t>2-1</w:t>
-            </w:r>
-          </w:p>
-        </w:tc>
-        <w:tc>
-          <w:tcPr>
-            <w:tcW w:w="3600" w:type="dxa"/>
-            <w:tcMar>
-              <w:top w:w="40" w:type="dxa"/>
-              <w:left w:w="80" w:type="dxa"/>
-              <w:bottom w:w="40" w:type="dxa"/>
-              <w:right w:w="80" w:type="dxa"/>
-            </w:tcMar>
-          </w:tcPr>
-          <w:p>
-            <w:r>
-              <w:rPr>
-                <w:rFonts w:ascii="Consolas" w:hAnsi="Consolas"/>
-                <w:sz w:val="16"/>
-                <w:szCs w:val="16"/>
-              </w:rPr>
-              <w:t>CSRF2=$(curl .../signup | ...)</w:t>
-            </w:r>
-          </w:p>
-        </w:tc>
-        <w:tc>
-          <w:tcPr>
-            <w:tcW w:w="4700" w:type="dxa"/>
-            <w:tcMar>
-              <w:top w:w="40" w:type="dxa"/>
-              <w:left w:w="80" w:type="dxa"/>
-              <w:bottom w:w="40" w:type="dxa"/>
-              <w:right w:w="80" w:type="dxa"/>
-            </w:tcMar>
-          </w:tcPr>
-          <w:p>
-            <w:r>
-              <w:rPr>
-                <w:rFonts w:ascii="Consolas" w:hAnsi="Consolas"/>
-                <w:sz w:val="16"/>
-                <w:szCs w:val="16"/>
-              </w:rPr>
-              <w:t>회원가입</w:t>
-            </w:r>
-            <w:r>
-              <w:rPr>
-                <w:rFonts w:ascii="Consolas" w:hAnsi="Consolas"/>
-                <w:sz w:val="16"/>
-                <w:szCs w:val="16"/>
-              </w:rPr>
-              <w:t xml:space="preserve"> </w:t>
-            </w:r>
-            <w:r>
-              <w:rPr>
-                <w:rFonts w:ascii="Consolas" w:hAnsi="Consolas"/>
-                <w:sz w:val="16"/>
-                <w:szCs w:val="16"/>
-              </w:rPr>
-              <w:t>폼</w:t>
-            </w:r>
-            <w:r>
-              <w:rPr>
-                <w:rFonts w:ascii="Consolas" w:hAnsi="Consolas"/>
-                <w:sz w:val="16"/>
-                <w:szCs w:val="16"/>
-              </w:rPr>
-              <w:t xml:space="preserve"> </w:t>
-            </w:r>
-            <w:r>
-              <w:rPr>
-                <w:rFonts w:ascii="Consolas" w:hAnsi="Consolas"/>
-                <w:sz w:val="16"/>
-                <w:szCs w:val="16"/>
-              </w:rPr>
-              <w:t>전용</w:t>
-            </w:r>
-            <w:r>
-              <w:rPr>
-                <w:rFonts w:ascii="Consolas" w:hAnsi="Consolas"/>
-                <w:sz w:val="16"/>
-                <w:szCs w:val="16"/>
-              </w:rPr>
-              <w:t xml:space="preserve"> _csrf </w:t>
-            </w:r>
-            <w:r>
-              <w:rPr>
-                <w:rFonts w:ascii="Consolas" w:hAnsi="Consolas"/>
-                <w:sz w:val="16"/>
-                <w:szCs w:val="16"/>
-              </w:rPr>
-              <w:t>토큰을</w:t>
-            </w:r>
-            <w:r>
-              <w:rPr>
-                <w:rFonts w:ascii="Consolas" w:hAnsi="Consolas"/>
-                <w:sz w:val="16"/>
-                <w:szCs w:val="16"/>
-              </w:rPr>
-              <w:t xml:space="preserve"> </w:t>
-            </w:r>
-            <w:r>
-              <w:rPr>
-                <w:rFonts w:ascii="Consolas" w:hAnsi="Consolas"/>
-                <w:sz w:val="16"/>
-                <w:szCs w:val="16"/>
-              </w:rPr>
-              <w:t>다시</w:t>
-            </w:r>
-            <w:r>
-              <w:rPr>
-                <w:rFonts w:ascii="Consolas" w:hAnsi="Consolas"/>
-                <w:sz w:val="16"/>
-                <w:szCs w:val="16"/>
-              </w:rPr>
-              <w:t xml:space="preserve"> </w:t>
-            </w:r>
-            <w:r>
-              <w:rPr>
-                <w:rFonts w:ascii="Consolas" w:hAnsi="Consolas"/>
-                <w:sz w:val="16"/>
-                <w:szCs w:val="16"/>
-              </w:rPr>
-              <w:t>추출</w:t>
-            </w:r>
-            <w:r>
-              <w:rPr>
-                <w:rFonts w:ascii="Consolas" w:hAnsi="Consolas"/>
-                <w:sz w:val="16"/>
-                <w:szCs w:val="16"/>
-              </w:rPr>
-              <w:t>(</w:t>
-            </w:r>
-            <w:r>
-              <w:rPr>
-                <w:rFonts w:ascii="Consolas" w:hAnsi="Consolas"/>
-                <w:sz w:val="16"/>
-                <w:szCs w:val="16"/>
-              </w:rPr>
-              <w:t>세션은</w:t>
-            </w:r>
-            <w:r>
-              <w:rPr>
-                <w:rFonts w:ascii="Consolas" w:hAnsi="Consolas"/>
-                <w:sz w:val="16"/>
-                <w:szCs w:val="16"/>
-              </w:rPr>
-              <w:t xml:space="preserve"> 1</w:t>
-            </w:r>
-            <w:r>
-              <w:rPr>
-                <w:rFonts w:ascii="Consolas" w:hAnsi="Consolas"/>
-                <w:sz w:val="16"/>
-                <w:szCs w:val="16"/>
-              </w:rPr>
-              <w:t>에서</w:t>
-            </w:r>
-            <w:r>
-              <w:rPr>
-                <w:rFonts w:ascii="Consolas" w:hAnsi="Consolas"/>
-                <w:sz w:val="16"/>
-                <w:szCs w:val="16"/>
-              </w:rPr>
-              <w:t xml:space="preserve"> </w:t>
-            </w:r>
-            <w:r>
-              <w:rPr>
-                <w:rFonts w:ascii="Consolas" w:hAnsi="Consolas"/>
-                <w:sz w:val="16"/>
-                <w:szCs w:val="16"/>
-              </w:rPr>
-              <w:t>로그인된</w:t>
-            </w:r>
-            <w:r>
-              <w:rPr>
-                <w:rFonts w:ascii="Consolas" w:hAnsi="Consolas"/>
-                <w:sz w:val="16"/>
-                <w:szCs w:val="16"/>
-              </w:rPr>
-              <w:t xml:space="preserve"> </w:t>
-            </w:r>
-            <w:r>
-              <w:rPr>
-                <w:rFonts w:ascii="Consolas" w:hAnsi="Consolas"/>
-                <w:sz w:val="16"/>
-                <w:szCs w:val="16"/>
-              </w:rPr>
-              <w:t>상태</w:t>
-            </w:r>
-            <w:r>
-              <w:rPr>
-                <w:rFonts w:ascii="Consolas" w:hAnsi="Consolas"/>
-                <w:sz w:val="16"/>
-                <w:szCs w:val="16"/>
-              </w:rPr>
-              <w:t xml:space="preserve"> </w:t>
-            </w:r>
-            <w:r>
-              <w:rPr>
-                <w:rFonts w:ascii="Consolas" w:hAnsi="Consolas"/>
-                <w:sz w:val="16"/>
-                <w:szCs w:val="16"/>
-              </w:rPr>
-              <w:t>유지</w:t>
-            </w:r>
-            <w:r>
-              <w:rPr>
-                <w:rFonts w:ascii="Consolas" w:hAnsi="Consolas"/>
-                <w:sz w:val="16"/>
-                <w:szCs w:val="16"/>
-              </w:rPr>
-              <w:t>)</w:t>
-            </w:r>
-          </w:p>
-        </w:tc>
-      </w:tr>
-      <w:tr>
-        <w:tc>
-          <w:tcPr>
-            <w:tcW w:w="700" w:type="dxa"/>
-            <w:tcMar>
-              <w:top w:w="40" w:type="dxa"/>
-              <w:left w:w="80" w:type="dxa"/>
-              <w:bottom w:w="40" w:type="dxa"/>
-              <w:right w:w="80" w:type="dxa"/>
-            </w:tcMar>
-          </w:tcPr>
-          <w:p>
-            <w:r>
-              <w:rPr>
-                <w:rFonts w:ascii="Consolas" w:hAnsi="Consolas"/>
-                <w:sz w:val="16"/>
-                <w:szCs w:val="16"/>
-              </w:rPr>
-              <w:t>2-2 (</w:t>
-            </w:r>
-            <w:r>
-              <w:rPr>
-                <w:rFonts w:ascii="Consolas" w:hAnsi="Consolas"/>
-                <w:sz w:val="16"/>
-                <w:szCs w:val="16"/>
-              </w:rPr>
-              <w:t>공격</w:t>
-            </w:r>
-            <w:r>
-              <w:rPr>
-                <w:rFonts w:ascii="Consolas" w:hAnsi="Consolas"/>
-                <w:sz w:val="16"/>
-                <w:szCs w:val="16"/>
-              </w:rPr>
-              <w:t>)</w:t>
-            </w:r>
-          </w:p>
-        </w:tc>
-        <w:tc>
-          <w:tcPr>
-            <w:tcW w:w="3600" w:type="dxa"/>
-            <w:tcMar>
-              <w:top w:w="40" w:type="dxa"/>
-              <w:left w:w="80" w:type="dxa"/>
-              <w:bottom w:w="40" w:type="dxa"/>
-              <w:right w:w="80" w:type="dxa"/>
-            </w:tcMar>
-          </w:tcPr>
-          <w:p>
-            <w:r>
-              <w:rPr>
-                <w:rFonts w:ascii="Consolas" w:hAnsi="Consolas"/>
-                <w:sz w:val="16"/>
-                <w:szCs w:val="16"/>
-              </w:rPr>
-              <w:t>curl ... POST /users/adduser (name=&lt;script&gt;...)</w:t>
-            </w:r>
-          </w:p>
-        </w:tc>
-        <w:tc>
-          <w:tcPr>
-            <w:tcW w:w="4700" w:type="dxa"/>
-            <w:tcMar>
-              <w:top w:w="40" w:type="dxa"/>
-              <w:left w:w="80" w:type="dxa"/>
-              <w:bottom w:w="40" w:type="dxa"/>
-              <w:right w:w="80" w:type="dxa"/>
-            </w:tcMar>
-          </w:tcPr>
-          <w:p>
-            <w:r>
-              <w:rPr>
-                <w:rFonts w:ascii="Consolas" w:hAnsi="Consolas"/>
-                <w:sz w:val="16"/>
-                <w:szCs w:val="16"/>
-              </w:rPr>
-              <w:t>실제</w:t>
-            </w:r>
-            <w:r>
-              <w:rPr>
-                <w:rFonts w:ascii="Consolas" w:hAnsi="Consolas"/>
-                <w:sz w:val="16"/>
-                <w:szCs w:val="16"/>
-              </w:rPr>
-              <w:t xml:space="preserve"> </w:t>
-            </w:r>
-            <w:r>
-              <w:rPr>
-                <w:rFonts w:ascii="Consolas" w:hAnsi="Consolas"/>
-                <w:sz w:val="16"/>
-                <w:szCs w:val="16"/>
-              </w:rPr>
-              <w:t>공격</w:t>
-            </w:r>
-            <w:r>
-              <w:rPr>
-                <w:rFonts w:ascii="Consolas" w:hAnsi="Consolas"/>
-                <w:sz w:val="16"/>
-                <w:szCs w:val="16"/>
-              </w:rPr>
-              <w:t xml:space="preserve">. </w:t>
-            </w:r>
-            <w:r>
-              <w:rPr>
-                <w:rFonts w:ascii="Consolas" w:hAnsi="Consolas"/>
-                <w:sz w:val="16"/>
-                <w:szCs w:val="16"/>
-              </w:rPr>
-              <w:t>이름</w:t>
-            </w:r>
-            <w:r>
-              <w:rPr>
-                <w:rFonts w:ascii="Consolas" w:hAnsi="Consolas"/>
-                <w:sz w:val="16"/>
-                <w:szCs w:val="16"/>
-              </w:rPr>
-              <w:t xml:space="preserve"> </w:t>
-            </w:r>
-            <w:r>
-              <w:rPr>
-                <w:rFonts w:ascii="Consolas" w:hAnsi="Consolas"/>
-                <w:sz w:val="16"/>
-                <w:szCs w:val="16"/>
-              </w:rPr>
-              <w:t>필드에</w:t>
-            </w:r>
-            <w:r>
-              <w:rPr>
-                <w:rFonts w:ascii="Consolas" w:hAnsi="Consolas"/>
-                <w:sz w:val="16"/>
-                <w:szCs w:val="16"/>
-              </w:rPr>
-              <w:t xml:space="preserve"> </w:t>
-            </w:r>
-            <w:r>
-              <w:rPr>
-                <w:rFonts w:ascii="Consolas" w:hAnsi="Consolas"/>
-                <w:sz w:val="16"/>
-                <w:szCs w:val="16"/>
-              </w:rPr>
-              <w:t>스크립트를</w:t>
-            </w:r>
-            <w:r>
-              <w:rPr>
-                <w:rFonts w:ascii="Consolas" w:hAnsi="Consolas"/>
-                <w:sz w:val="16"/>
-                <w:szCs w:val="16"/>
-              </w:rPr>
-              <w:t xml:space="preserve"> </w:t>
-            </w:r>
-            <w:r>
-              <w:rPr>
-                <w:rFonts w:ascii="Consolas" w:hAnsi="Consolas"/>
-                <w:sz w:val="16"/>
-                <w:szCs w:val="16"/>
-              </w:rPr>
-              <w:t>넣어</w:t>
-            </w:r>
-            <w:r>
-              <w:rPr>
-                <w:rFonts w:ascii="Consolas" w:hAnsi="Consolas"/>
-                <w:sz w:val="16"/>
-                <w:szCs w:val="16"/>
-              </w:rPr>
-              <w:t xml:space="preserve"> </w:t>
-            </w:r>
-            <w:r>
-              <w:rPr>
-                <w:rFonts w:ascii="Consolas" w:hAnsi="Consolas"/>
-                <w:sz w:val="16"/>
-                <w:szCs w:val="16"/>
-              </w:rPr>
-              <w:t>회원가입</w:t>
-            </w:r>
-            <w:r>
-              <w:rPr>
-                <w:rFonts w:ascii="Consolas" w:hAnsi="Consolas"/>
-                <w:sz w:val="16"/>
-                <w:szCs w:val="16"/>
-              </w:rPr>
-              <w:t xml:space="preserve"> → DB</w:t>
-            </w:r>
-            <w:r>
-              <w:rPr>
-                <w:rFonts w:ascii="Consolas" w:hAnsi="Consolas"/>
-                <w:sz w:val="16"/>
-                <w:szCs w:val="16"/>
-              </w:rPr>
-              <w:t>에</w:t>
-            </w:r>
-            <w:r>
-              <w:rPr>
-                <w:rFonts w:ascii="Consolas" w:hAnsi="Consolas"/>
-                <w:sz w:val="16"/>
-                <w:szCs w:val="16"/>
-              </w:rPr>
-              <w:t xml:space="preserve"> </w:t>
-            </w:r>
-            <w:r>
-              <w:rPr>
-                <w:rFonts w:ascii="Consolas" w:hAnsi="Consolas"/>
-                <w:sz w:val="16"/>
-                <w:szCs w:val="16"/>
-              </w:rPr>
-              <w:t>그대로</w:t>
-            </w:r>
-            <w:r>
-              <w:rPr>
-                <w:rFonts w:ascii="Consolas" w:hAnsi="Consolas"/>
-                <w:sz w:val="16"/>
-                <w:szCs w:val="16"/>
-              </w:rPr>
-              <w:t xml:space="preserve"> </w:t>
-            </w:r>
-            <w:r>
-              <w:rPr>
-                <w:rFonts w:ascii="Consolas" w:hAnsi="Consolas"/>
-                <w:sz w:val="16"/>
-                <w:szCs w:val="16"/>
-              </w:rPr>
-              <w:t>저장</w:t>
-            </w:r>
-            <w:r>
-              <w:rPr>
-                <w:rFonts w:ascii="Consolas" w:hAnsi="Consolas"/>
-                <w:sz w:val="16"/>
-                <w:szCs w:val="16"/>
-              </w:rPr>
-              <w:t xml:space="preserve">(Stored). </w:t>
-            </w:r>
-            <w:r>
-              <w:rPr>
-                <w:rFonts w:ascii="Consolas" w:hAnsi="Consolas"/>
-                <w:sz w:val="16"/>
-                <w:szCs w:val="16"/>
-              </w:rPr>
-              <w:t>이</w:t>
-            </w:r>
-            <w:r>
-              <w:rPr>
-                <w:rFonts w:ascii="Consolas" w:hAnsi="Consolas"/>
-                <w:sz w:val="16"/>
-                <w:szCs w:val="16"/>
-              </w:rPr>
-              <w:t xml:space="preserve"> </w:t>
-            </w:r>
-            <w:r>
-              <w:rPr>
-                <w:rFonts w:ascii="Consolas" w:hAnsi="Consolas"/>
-                <w:sz w:val="16"/>
-                <w:szCs w:val="16"/>
-              </w:rPr>
-              <w:t>요청</w:t>
-            </w:r>
-            <w:r>
-              <w:rPr>
-                <w:rFonts w:ascii="Consolas" w:hAnsi="Consolas"/>
-                <w:sz w:val="16"/>
-                <w:szCs w:val="16"/>
-              </w:rPr>
-              <w:t xml:space="preserve"> </w:t>
-            </w:r>
-            <w:r>
-              <w:rPr>
-                <w:rFonts w:ascii="Consolas" w:hAnsi="Consolas"/>
-                <w:sz w:val="16"/>
-                <w:szCs w:val="16"/>
-              </w:rPr>
-              <w:t>한</w:t>
-            </w:r>
-            <w:r>
-              <w:rPr>
-                <w:rFonts w:ascii="Consolas" w:hAnsi="Consolas"/>
-                <w:sz w:val="16"/>
-                <w:szCs w:val="16"/>
-              </w:rPr>
-              <w:t xml:space="preserve"> </w:t>
-            </w:r>
-            <w:r>
-              <w:rPr>
-                <w:rFonts w:ascii="Consolas" w:hAnsi="Consolas"/>
-                <w:sz w:val="16"/>
-                <w:szCs w:val="16"/>
-              </w:rPr>
-              <w:t>번으로</w:t>
-            </w:r>
-            <w:r>
-              <w:rPr>
-                <w:rFonts w:ascii="Consolas" w:hAnsi="Consolas"/>
-                <w:sz w:val="16"/>
-                <w:szCs w:val="16"/>
-              </w:rPr>
-              <w:t xml:space="preserve"> </w:t>
-            </w:r>
-            <w:r>
-              <w:rPr>
-                <w:rFonts w:ascii="Consolas" w:hAnsi="Consolas"/>
-                <w:sz w:val="16"/>
-                <w:szCs w:val="16"/>
-              </w:rPr>
-              <w:t>공격이</w:t>
-            </w:r>
-            <w:r>
-              <w:rPr>
-                <w:rFonts w:ascii="Consolas" w:hAnsi="Consolas"/>
-                <w:sz w:val="16"/>
-                <w:szCs w:val="16"/>
-              </w:rPr>
-              <w:t xml:space="preserve"> </w:t>
-            </w:r>
-            <w:r>
-              <w:rPr>
-                <w:rFonts w:ascii="Consolas" w:hAnsi="Consolas"/>
-                <w:sz w:val="16"/>
-                <w:szCs w:val="16"/>
-              </w:rPr>
-              <w:t>완성된다</w:t>
-            </w:r>
-          </w:p>
-        </w:tc>
-      </w:tr>
-      <w:tr>
-        <w:tc>
-          <w:tcPr>
-            <w:tcW w:w="700" w:type="dxa"/>
-            <w:tcMar>
-              <w:top w:w="40" w:type="dxa"/>
-              <w:left w:w="80" w:type="dxa"/>
-              <w:bottom w:w="40" w:type="dxa"/>
-              <w:right w:w="80" w:type="dxa"/>
-            </w:tcMar>
-          </w:tcPr>
-          <w:p>
-            <w:r>
-              <w:rPr>
-                <w:rFonts w:ascii="Consolas" w:hAnsi="Consolas"/>
-                <w:sz w:val="16"/>
-                <w:szCs w:val="16"/>
-              </w:rPr>
-              <w:t>3</w:t>
-            </w:r>
-          </w:p>
-        </w:tc>
-        <w:tc>
-          <w:tcPr>
-            <w:tcW w:w="3600" w:type="dxa"/>
-            <w:tcMar>
-              <w:top w:w="40" w:type="dxa"/>
-              <w:left w:w="80" w:type="dxa"/>
-              <w:bottom w:w="40" w:type="dxa"/>
-              <w:right w:w="80" w:type="dxa"/>
-            </w:tcMar>
-          </w:tcPr>
-          <w:p>
-            <w:r>
-              <w:rPr>
-                <w:rFonts w:ascii="Consolas" w:hAnsi="Consolas"/>
-                <w:sz w:val="16"/>
-                <w:szCs w:val="16"/>
-              </w:rPr>
-              <w:t>curl .../index , .../index-vuln</w:t>
-            </w:r>
-          </w:p>
-        </w:tc>
-        <w:tc>
-          <w:tcPr>
-            <w:tcW w:w="4700" w:type="dxa"/>
-            <w:tcMar>
-              <w:top w:w="40" w:type="dxa"/>
-              <w:left w:w="80" w:type="dxa"/>
-              <w:bottom w:w="40" w:type="dxa"/>
-              <w:right w:w="80" w:type="dxa"/>
-            </w:tcMar>
-          </w:tcPr>
-          <w:p>
-            <w:r>
-              <w:rPr>
-                <w:rFonts w:ascii="Consolas" w:hAnsi="Consolas"/>
-                <w:sz w:val="16"/>
-                <w:szCs w:val="16"/>
-              </w:rPr>
-              <w:t>공격</w:t>
-            </w:r>
-            <w:r>
-              <w:rPr>
-                <w:rFonts w:ascii="Consolas" w:hAnsi="Consolas"/>
-                <w:sz w:val="16"/>
-                <w:szCs w:val="16"/>
-              </w:rPr>
-              <w:t xml:space="preserve"> </w:t>
-            </w:r>
-            <w:r>
-              <w:rPr>
-                <w:rFonts w:ascii="Consolas" w:hAnsi="Consolas"/>
-                <w:sz w:val="16"/>
-                <w:szCs w:val="16"/>
-              </w:rPr>
-              <w:t>확인</w:t>
-            </w:r>
-            <w:r>
-              <w:rPr>
-                <w:rFonts w:ascii="Consolas" w:hAnsi="Consolas"/>
-                <w:sz w:val="16"/>
-                <w:szCs w:val="16"/>
-              </w:rPr>
-              <w:t xml:space="preserve"> </w:t>
-            </w:r>
-            <w:r>
-              <w:rPr>
-                <w:rFonts w:ascii="Consolas" w:hAnsi="Consolas"/>
-                <w:sz w:val="16"/>
-                <w:szCs w:val="16"/>
-              </w:rPr>
-              <w:t>단계</w:t>
-            </w:r>
-            <w:r>
-              <w:rPr>
-                <w:rFonts w:ascii="Consolas" w:hAnsi="Consolas"/>
-                <w:sz w:val="16"/>
-                <w:szCs w:val="16"/>
-              </w:rPr>
-              <w:t xml:space="preserve">. </w:t>
-            </w:r>
-            <w:r>
-              <w:rPr>
-                <w:rFonts w:ascii="Consolas" w:hAnsi="Consolas"/>
-                <w:sz w:val="16"/>
-                <w:szCs w:val="16"/>
-              </w:rPr>
-              <w:t>두</w:t>
-            </w:r>
-            <w:r>
-              <w:rPr>
-                <w:rFonts w:ascii="Consolas" w:hAnsi="Consolas"/>
-                <w:sz w:val="16"/>
-                <w:szCs w:val="16"/>
-              </w:rPr>
-              <w:t xml:space="preserve"> </w:t>
-            </w:r>
-            <w:r>
-              <w:rPr>
-                <w:rFonts w:ascii="Consolas" w:hAnsi="Consolas"/>
-                <w:sz w:val="16"/>
-                <w:szCs w:val="16"/>
-              </w:rPr>
-              <w:t>목록</w:t>
-            </w:r>
-            <w:r>
-              <w:rPr>
-                <w:rFonts w:ascii="Consolas" w:hAnsi="Consolas"/>
-                <w:sz w:val="16"/>
-                <w:szCs w:val="16"/>
-              </w:rPr>
-              <w:t xml:space="preserve"> </w:t>
-            </w:r>
-            <w:r>
-              <w:rPr>
-                <w:rFonts w:ascii="Consolas" w:hAnsi="Consolas"/>
-                <w:sz w:val="16"/>
-                <w:szCs w:val="16"/>
-              </w:rPr>
-              <w:t>페이지의</w:t>
-            </w:r>
-            <w:r>
-              <w:rPr>
-                <w:rFonts w:ascii="Consolas" w:hAnsi="Consolas"/>
-                <w:sz w:val="16"/>
-                <w:szCs w:val="16"/>
-              </w:rPr>
-              <w:t xml:space="preserve"> raw HTML</w:t>
-            </w:r>
-            <w:r>
-              <w:rPr>
-                <w:rFonts w:ascii="Consolas" w:hAnsi="Consolas"/>
-                <w:sz w:val="16"/>
-                <w:szCs w:val="16"/>
-              </w:rPr>
-              <w:t>에서</w:t>
-            </w:r>
-            <w:r>
-              <w:rPr>
-                <w:rFonts w:ascii="Consolas" w:hAnsi="Consolas"/>
-                <w:sz w:val="16"/>
-                <w:szCs w:val="16"/>
-              </w:rPr>
-              <w:t xml:space="preserve"> &lt;script&gt;</w:t>
-            </w:r>
-            <w:r>
-              <w:rPr>
-                <w:rFonts w:ascii="Consolas" w:hAnsi="Consolas"/>
-                <w:sz w:val="16"/>
-                <w:szCs w:val="16"/>
-              </w:rPr>
-              <w:t>가</w:t>
-            </w:r>
-            <w:r>
-              <w:rPr>
-                <w:rFonts w:ascii="Consolas" w:hAnsi="Consolas"/>
-                <w:sz w:val="16"/>
-                <w:szCs w:val="16"/>
-              </w:rPr>
-              <w:t xml:space="preserve"> </w:t>
-            </w:r>
-            <w:r>
-              <w:rPr>
-                <w:rFonts w:ascii="Consolas" w:hAnsi="Consolas"/>
-                <w:sz w:val="16"/>
-                <w:szCs w:val="16"/>
-              </w:rPr>
-              <w:t>이스케이프됐는지</w:t>
-            </w:r>
-            <w:r>
-              <w:rPr>
-                <w:rFonts w:ascii="Consolas" w:hAnsi="Consolas"/>
-                <w:sz w:val="16"/>
-                <w:szCs w:val="16"/>
-              </w:rPr>
-              <w:t xml:space="preserve">(&amp;lt;script&amp;gt;) </w:t>
-            </w:r>
-            <w:r>
-              <w:rPr>
-                <w:rFonts w:ascii="Consolas" w:hAnsi="Consolas"/>
-                <w:sz w:val="16"/>
-                <w:szCs w:val="16"/>
-              </w:rPr>
-              <w:t>그대로인지</w:t>
-            </w:r>
-            <w:r>
-              <w:rPr>
-                <w:rFonts w:ascii="Consolas" w:hAnsi="Consolas"/>
-                <w:sz w:val="16"/>
-                <w:szCs w:val="16"/>
-              </w:rPr>
-              <w:t>(&lt;script&gt;) grep</w:t>
-            </w:r>
-            <w:r>
-              <w:rPr>
-                <w:rFonts w:ascii="Consolas" w:hAnsi="Consolas"/>
-                <w:sz w:val="16"/>
-                <w:szCs w:val="16"/>
-              </w:rPr>
-              <w:t>으로</w:t>
-            </w:r>
-            <w:r>
-              <w:rPr>
-                <w:rFonts w:ascii="Consolas" w:hAnsi="Consolas"/>
-                <w:sz w:val="16"/>
-                <w:szCs w:val="16"/>
-              </w:rPr>
-              <w:t xml:space="preserve"> </w:t>
-            </w:r>
-            <w:r>
-              <w:rPr>
-                <w:rFonts w:ascii="Consolas" w:hAnsi="Consolas"/>
-                <w:sz w:val="16"/>
-                <w:szCs w:val="16"/>
-              </w:rPr>
-              <w:t>비교</w:t>
+              <w:t xml:space="preserve">공격 확인 단계. 두 목록 페이지의 raw HTML에서 &lt;script&gt;가 이스케이프됐는지(&amp;lt;script&amp;gt;) 그대로인지(&lt;script&gt;) grep으로 비교</w:t>
             </w:r>
           </w:p>
         </w:tc>
@@ -5909,12 +2777,6 @@
           <w:bCs/>
         </w:rPr>
         <w:t xml:space="preserve">하지만 여기서 꼭 짚어야 할 점: HttpOnly는 "JS가 쿠키 값을 읽는 것"만 막는다. "브라우저가 요청에 그 쿠키를 자동으로 실어 보내는 것"은 전혀 막지 못한다. 즉 공격자의 스크립트가 쿠키 값을 몰라도, 같은 페이지 안에서 fetch()/XMLHttpRequest로 요청을 보내면 브라우저가 평소처럼 JSESSIONID를 </w:t>
-      </w:r>
-      <w:r>
-        <w:rPr>
-          <w:b/>
-          <w:bCs/>
-        </w:rPr>
         <w:lastRenderedPageBreak/>
         <w:t>자동으로 붙여준다 — 공격자는 쿠키를 훔칠 필요 없이 피해자의 세션을 그 자리에서 바로 빌려 쓸 수 있다.</w:t>
       </w:r>
@@ -6260,151 +3122,23 @@
           <w:sz w:val="18"/>
           <w:szCs w:val="18"/>
         </w:rPr>
-        <w:t>@NotBlank(message = "Name</w:t>
-      </w:r>
+        <w:t xml:space="preserve">@NotBlank(message = "Name은 필수 입력항목입니다.")</w:t>
+      </w:r>
+    </w:p>
+    <w:p>
+      <w:pPr>
+        <w:pBdr>
+          <w:left w:val="single" w:sz="18" w:space="6" w:color="C0C0C0"/>
+        </w:pBdr>
+        <w:shd w:val="clear" w:color="auto" w:fill="F4F4F4"/>
+      </w:pPr>
       <w:r>
         <w:rPr>
           <w:rFonts w:ascii="Consolas" w:hAnsi="Consolas"/>
           <w:sz w:val="18"/>
           <w:szCs w:val="18"/>
         </w:rPr>
-        <w:t>은</w:t>
-      </w:r>
-      <w:r>
-        <w:rPr>
-          <w:rFonts w:ascii="Consolas" w:hAnsi="Consolas"/>
-          <w:sz w:val="18"/>
-          <w:szCs w:val="18"/>
-        </w:rPr>
-        <w:t xml:space="preserve"> </w:t>
-      </w:r>
-      <w:r>
-        <w:rPr>
-          <w:rFonts w:ascii="Consolas" w:hAnsi="Consolas"/>
-          <w:sz w:val="18"/>
-          <w:szCs w:val="18"/>
-        </w:rPr>
-        <w:t>필수</w:t>
-      </w:r>
-      <w:r>
-        <w:rPr>
-          <w:rFonts w:ascii="Consolas" w:hAnsi="Consolas"/>
-          <w:sz w:val="18"/>
-          <w:szCs w:val="18"/>
-        </w:rPr>
-        <w:t xml:space="preserve"> </w:t>
-      </w:r>
-      <w:r>
-        <w:rPr>
-          <w:rFonts w:ascii="Consolas" w:hAnsi="Consolas"/>
-          <w:sz w:val="18"/>
-          <w:szCs w:val="18"/>
-        </w:rPr>
-        <w:t>입력항목입니다</w:t>
-      </w:r>
-      <w:r>
-        <w:rPr>
-          <w:rFonts w:ascii="Consolas" w:hAnsi="Consolas"/>
-          <w:sz w:val="18"/>
-          <w:szCs w:val="18"/>
-        </w:rPr>
-        <w:t>.")</w:t>
-      </w:r>
-    </w:p>
-    <w:p>
-      <w:pPr>
-        <w:pBdr>
-          <w:left w:val="single" w:sz="18" w:space="6" w:color="C0C0C0"/>
-        </w:pBdr>
-        <w:shd w:val="clear" w:color="auto" w:fill="F4F4F4"/>
-      </w:pPr>
-      <w:r>
-        <w:rPr>
-          <w:rFonts w:ascii="Consolas" w:hAnsi="Consolas"/>
-          <w:sz w:val="18"/>
-          <w:szCs w:val="18"/>
-        </w:rPr>
-        <w:t>@Size(max = 50, message = "</w:t>
-      </w:r>
-      <w:r>
-        <w:rPr>
-          <w:rFonts w:ascii="Consolas" w:hAnsi="Consolas"/>
-          <w:sz w:val="18"/>
-          <w:szCs w:val="18"/>
-        </w:rPr>
-        <w:t>이름은</w:t>
-      </w:r>
-      <w:r>
-        <w:rPr>
-          <w:rFonts w:ascii="Consolas" w:hAnsi="Consolas"/>
-          <w:sz w:val="18"/>
-          <w:szCs w:val="18"/>
-        </w:rPr>
-        <w:t xml:space="preserve"> 50</w:t>
-      </w:r>
-      <w:r>
-        <w:rPr>
-          <w:rFonts w:ascii="Consolas" w:hAnsi="Consolas"/>
-          <w:sz w:val="18"/>
-          <w:szCs w:val="18"/>
-        </w:rPr>
-        <w:t>자를</w:t>
-      </w:r>
-      <w:r>
-        <w:rPr>
-          <w:rFonts w:ascii="Consolas" w:hAnsi="Consolas"/>
-          <w:sz w:val="18"/>
-          <w:szCs w:val="18"/>
-        </w:rPr>
-        <w:t xml:space="preserve"> </w:t>
-      </w:r>
-      <w:r>
-        <w:rPr>
-          <w:rFonts w:ascii="Consolas" w:hAnsi="Consolas"/>
-          <w:sz w:val="18"/>
-          <w:szCs w:val="18"/>
-        </w:rPr>
-        <w:t>넘을</w:t>
-      </w:r>
-      <w:r>
-        <w:rPr>
-          <w:rFonts w:ascii="Consolas" w:hAnsi="Consolas"/>
-          <w:sz w:val="18"/>
-          <w:szCs w:val="18"/>
-        </w:rPr>
-        <w:t xml:space="preserve"> </w:t>
-      </w:r>
-      <w:r>
-        <w:rPr>
-          <w:rFonts w:ascii="Consolas" w:hAnsi="Consolas"/>
-          <w:sz w:val="18"/>
-          <w:szCs w:val="18"/>
-        </w:rPr>
-        <w:t>수</w:t>
-      </w:r>
-      <w:r>
-        <w:rPr>
-          <w:rFonts w:ascii="Consolas" w:hAnsi="Consolas"/>
-          <w:sz w:val="18"/>
-          <w:szCs w:val="18"/>
-        </w:rPr>
-        <w:t xml:space="preserve"> </w:t>
-      </w:r>
-      <w:r>
-        <w:rPr>
-          <w:rFonts w:ascii="Consolas" w:hAnsi="Consolas"/>
-          <w:sz w:val="18"/>
-          <w:szCs w:val="18"/>
-        </w:rPr>
-        <w:t>없습니다</w:t>
-      </w:r>
-      <w:r>
-        <w:rPr>
-          <w:rFonts w:ascii="Consolas" w:hAnsi="Consolas"/>
-          <w:sz w:val="18"/>
-          <w:szCs w:val="18"/>
-        </w:rPr>
-        <w:t>.")</w:t>
+        <w:t xml:space="preserve">@Size(max = 50, message = "이름은 50자를 넘을 수 없습니다.")</w:t>
       </w:r>
     </w:p>
     <w:p>
@@ -7405,7 +4139,7 @@
           <w:bCs/>
           <w:color w:val="2E5496"/>
         </w:rPr>
-        <w:t>4-4. 심층 방어 — CSP(Content-Security-Policy) 헤더(선택)</w:t>
+        <w:t>4-4. 심층 방어 — CSP(Content-Security-Policy) 헤더 (적용됨 — 2026-10-13)</w:t>
       </w:r>
     </w:p>
     <w:p>
@@ -7422,7 +4156,7 @@
         <w:t xml:space="preserve"> </w:t>
       </w:r>
       <w:r>
-        <w:t>보내면, 인라인 &lt;script&gt;나 외부 스크립트 로드를 브라우저 차원에서 차단해 XSS의 피해를 줄일 수 있다(이 앱에는 미적용 — 운영 환경에서 고려할 항목으로 기록).</w:t>
+        <w:t>보내면, 인라인 &lt;script&gt;나 신뢰하지 않은 외부 스크립트 로드를 브라우저 차원에서 차단해 XSS의 피해를 줄일 수 있다. SecurityConfig.formLoginFilterChain 에 "script-src 'self' https://cdn.jsdelivr.net; style-src 'self' https://cdn.jsdelivr.net; img-src 'self'; object-src 'none'; base-uri 'self'; frame-ancestors 'self'" 정책을 적용했다. 삭제 폼의 inline onsubmit/style 은 외부 js(confirm-delete.js)/Bootstrap 클래스(d-inline)로 옮겨 'unsafe-inline' 없이 적용했다. 적용 코드와 검증 방법은 이 문서(07_XSS.md) §4-4 참고.</w:t>
       </w:r>
     </w:p>
     <w:tbl>
@@ -7850,7 +4584,7 @@
                 <w:sz w:val="18"/>
                 <w:szCs w:val="18"/>
               </w:rPr>
-              <w:t>CSP 헤더(심화)</w:t>
+              <w:t>CSP 헤더(심화, 적용됨)</w:t>
             </w:r>
           </w:p>
         </w:tc>
@@ -7870,7 +4604,7 @@
                 <w:sz w:val="18"/>
                 <w:szCs w:val="18"/>
               </w:rPr>
-              <w:t>뚫렸을 때의 2차 방어선 — 인라인/외부 스크립트 실행 범위 제한</w:t>
+              <w:t>뚫렸을 때의 2차 방어선 — script-src 'self' 로 인라인/신뢰 안 된 외부 스크립트 실행 차단(적용됨)</w:t>
             </w:r>
           </w:p>
         </w:tc>

</xml_diff>